<commit_message>
Ae5: diagramas de clases y secuencias Correcciones
</commit_message>
<xml_diff>
--- a/Ae5-Modelos-UML/Sanginez_Tony_Ae5_Paquete_Modelos_UML.docx
+++ b/Ae5-Modelos-UML/Sanginez_Tony_Ae5_Paquete_Modelos_UML.docx
@@ -1370,7 +1370,7 @@
             </w:rPr>
             <w:fldChar w:fldCharType="separate"/>
           </w:r>
-          <w:hyperlink w:anchor="_Toc240906767" w:history="1">
+          <w:hyperlink w:anchor="_Toc240908195" w:history="1">
             <w:r>
               <w:rPr>
                 <w:rStyle w:val="Hipervnculo"/>
@@ -1398,7 +1398,7 @@
                 <w:noProof/>
                 <w:webHidden/>
               </w:rPr>
-              <w:instrText xml:space="preserve"> PAGEREF _Toc240906767 \h </w:instrText>
+              <w:instrText xml:space="preserve"> PAGEREF _Toc240908195 \h </w:instrText>
             </w:r>
             <w:r>
               <w:rPr>
@@ -1445,7 +1445,7 @@
               <w14:ligatures w14:val="standardContextual"/>
             </w:rPr>
           </w:pPr>
-          <w:hyperlink w:anchor="_Toc240906768" w:history="1">
+          <w:hyperlink w:anchor="_Toc240908196" w:history="1">
             <w:r>
               <w:rPr>
                 <w:rStyle w:val="Hipervnculo"/>
@@ -1472,7 +1472,7 @@
                 <w:noProof/>
                 <w:webHidden/>
               </w:rPr>
-              <w:instrText xml:space="preserve"> PAGEREF _Toc240906768 \h </w:instrText>
+              <w:instrText xml:space="preserve"> PAGEREF _Toc240908196 \h </w:instrText>
             </w:r>
             <w:r>
               <w:rPr>
@@ -1519,7 +1519,7 @@
               <w14:ligatures w14:val="standardContextual"/>
             </w:rPr>
           </w:pPr>
-          <w:hyperlink w:anchor="_Toc240906769" w:history="1">
+          <w:hyperlink w:anchor="_Toc240908197" w:history="1">
             <w:r>
               <w:rPr>
                 <w:rStyle w:val="Hipervnculo"/>
@@ -1547,7 +1547,7 @@
                 <w:noProof/>
                 <w:webHidden/>
               </w:rPr>
-              <w:instrText xml:space="preserve"> PAGEREF _Toc240906769 \h </w:instrText>
+              <w:instrText xml:space="preserve"> PAGEREF _Toc240908197 \h </w:instrText>
             </w:r>
             <w:r>
               <w:rPr>
@@ -1594,11 +1594,12 @@
               <w14:ligatures w14:val="standardContextual"/>
             </w:rPr>
           </w:pPr>
-          <w:hyperlink w:anchor="_Toc240906770" w:history="1">
+          <w:hyperlink w:anchor="_Toc240908198" w:history="1">
             <w:r>
               <w:rPr>
                 <w:rStyle w:val="Hipervnculo"/>
                 <w:noProof/>
+                <w:lang w:val="es-EC"/>
               </w:rPr>
               <w:t>4. Catálogo de clases</w:t>
             </w:r>
@@ -1621,7 +1622,7 @@
                 <w:noProof/>
                 <w:webHidden/>
               </w:rPr>
-              <w:instrText xml:space="preserve"> PAGEREF _Toc240906770 \h </w:instrText>
+              <w:instrText xml:space="preserve"> PAGEREF _Toc240908198 \h </w:instrText>
             </w:r>
             <w:r>
               <w:rPr>
@@ -1668,7 +1669,7 @@
               <w14:ligatures w14:val="standardContextual"/>
             </w:rPr>
           </w:pPr>
-          <w:hyperlink w:anchor="_Toc240906771" w:history="1">
+          <w:hyperlink w:anchor="_Toc240908199" w:history="1">
             <w:r>
               <w:rPr>
                 <w:rStyle w:val="Hipervnculo"/>
@@ -1696,7 +1697,7 @@
                 <w:noProof/>
                 <w:webHidden/>
               </w:rPr>
-              <w:instrText xml:space="preserve"> PAGEREF _Toc240906771 \h </w:instrText>
+              <w:instrText xml:space="preserve"> PAGEREF _Toc240908199 \h </w:instrText>
             </w:r>
             <w:r>
               <w:rPr>
@@ -1743,7 +1744,7 @@
               <w14:ligatures w14:val="standardContextual"/>
             </w:rPr>
           </w:pPr>
-          <w:hyperlink w:anchor="_Toc240906772" w:history="1">
+          <w:hyperlink w:anchor="_Toc240908200" w:history="1">
             <w:r>
               <w:rPr>
                 <w:rStyle w:val="Hipervnculo"/>
@@ -1771,7 +1772,7 @@
                 <w:noProof/>
                 <w:webHidden/>
               </w:rPr>
-              <w:instrText xml:space="preserve"> PAGEREF _Toc240906772 \h </w:instrText>
+              <w:instrText xml:space="preserve"> PAGEREF _Toc240908200 \h </w:instrText>
             </w:r>
             <w:r>
               <w:rPr>
@@ -1818,7 +1819,7 @@
               <w14:ligatures w14:val="standardContextual"/>
             </w:rPr>
           </w:pPr>
-          <w:hyperlink w:anchor="_Toc240906773" w:history="1">
+          <w:hyperlink w:anchor="_Toc240908201" w:history="1">
             <w:r>
               <w:rPr>
                 <w:rStyle w:val="Hipervnculo"/>
@@ -1846,7 +1847,7 @@
                 <w:noProof/>
                 <w:webHidden/>
               </w:rPr>
-              <w:instrText xml:space="preserve"> PAGEREF _Toc240906773 \h </w:instrText>
+              <w:instrText xml:space="preserve"> PAGEREF _Toc240908201 \h </w:instrText>
             </w:r>
             <w:r>
               <w:rPr>
@@ -1893,11 +1894,12 @@
               <w14:ligatures w14:val="standardContextual"/>
             </w:rPr>
           </w:pPr>
-          <w:hyperlink w:anchor="_Toc240906774" w:history="1">
+          <w:hyperlink w:anchor="_Toc240908202" w:history="1">
             <w:r>
               <w:rPr>
                 <w:rStyle w:val="Hipervnculo"/>
                 <w:noProof/>
+                <w:lang w:val="es-EC"/>
               </w:rPr>
               <w:t>6. Diagrama de secuencia 1</w:t>
             </w:r>
@@ -1920,7 +1922,7 @@
                 <w:noProof/>
                 <w:webHidden/>
               </w:rPr>
-              <w:instrText xml:space="preserve"> PAGEREF _Toc240906774 \h </w:instrText>
+              <w:instrText xml:space="preserve"> PAGEREF _Toc240908202 \h </w:instrText>
             </w:r>
             <w:r>
               <w:rPr>
@@ -1940,7 +1942,7 @@
                 <w:noProof/>
                 <w:webHidden/>
               </w:rPr>
-              <w:t>10</w:t>
+              <w:t>11</w:t>
             </w:r>
             <w:r>
               <w:rPr>
@@ -1967,7 +1969,7 @@
               <w14:ligatures w14:val="standardContextual"/>
             </w:rPr>
           </w:pPr>
-          <w:hyperlink w:anchor="_Toc240906775" w:history="1">
+          <w:hyperlink w:anchor="_Toc240908203" w:history="1">
             <w:r>
               <w:rPr>
                 <w:rStyle w:val="Hipervnculo"/>
@@ -1994,7 +1996,7 @@
                 <w:noProof/>
                 <w:webHidden/>
               </w:rPr>
-              <w:instrText xml:space="preserve"> PAGEREF _Toc240906775 \h </w:instrText>
+              <w:instrText xml:space="preserve"> PAGEREF _Toc240908203 \h </w:instrText>
             </w:r>
             <w:r>
               <w:rPr>
@@ -2041,11 +2043,12 @@
               <w14:ligatures w14:val="standardContextual"/>
             </w:rPr>
           </w:pPr>
-          <w:hyperlink w:anchor="_Toc240906776" w:history="1">
+          <w:hyperlink w:anchor="_Toc240908204" w:history="1">
             <w:r>
               <w:rPr>
                 <w:rStyle w:val="Hipervnculo"/>
                 <w:noProof/>
+                <w:lang w:val="es-EC"/>
               </w:rPr>
               <w:t>8. Consistencia clases - secuencias</w:t>
             </w:r>
@@ -2068,7 +2071,7 @@
                 <w:noProof/>
                 <w:webHidden/>
               </w:rPr>
-              <w:instrText xml:space="preserve"> PAGEREF _Toc240906776 \h </w:instrText>
+              <w:instrText xml:space="preserve"> PAGEREF _Toc240908204 \h </w:instrText>
             </w:r>
             <w:r>
               <w:rPr>
@@ -2088,7 +2091,7 @@
                 <w:noProof/>
                 <w:webHidden/>
               </w:rPr>
-              <w:t>14</w:t>
+              <w:t>15</w:t>
             </w:r>
             <w:r>
               <w:rPr>
@@ -2115,7 +2118,7 @@
               <w14:ligatures w14:val="standardContextual"/>
             </w:rPr>
           </w:pPr>
-          <w:hyperlink w:anchor="_Toc240906777" w:history="1">
+          <w:hyperlink w:anchor="_Toc240908205" w:history="1">
             <w:r>
               <w:rPr>
                 <w:rStyle w:val="Hipervnculo"/>
@@ -2143,7 +2146,7 @@
                 <w:noProof/>
                 <w:webHidden/>
               </w:rPr>
-              <w:instrText xml:space="preserve"> PAGEREF _Toc240906777 \h </w:instrText>
+              <w:instrText xml:space="preserve"> PAGEREF _Toc240908205 \h </w:instrText>
             </w:r>
             <w:r>
               <w:rPr>
@@ -2190,7 +2193,7 @@
               <w14:ligatures w14:val="standardContextual"/>
             </w:rPr>
           </w:pPr>
-          <w:hyperlink w:anchor="_Toc240906778" w:history="1">
+          <w:hyperlink w:anchor="_Toc240908206" w:history="1">
             <w:r>
               <w:rPr>
                 <w:rStyle w:val="Hipervnculo"/>
@@ -2217,7 +2220,7 @@
                 <w:noProof/>
                 <w:webHidden/>
               </w:rPr>
-              <w:instrText xml:space="preserve"> PAGEREF _Toc240906778 \h </w:instrText>
+              <w:instrText xml:space="preserve"> PAGEREF _Toc240908206 \h </w:instrText>
             </w:r>
             <w:r>
               <w:rPr>
@@ -2237,7 +2240,7 @@
                 <w:noProof/>
                 <w:webHidden/>
               </w:rPr>
-              <w:t>17</w:t>
+              <w:t>18</w:t>
             </w:r>
             <w:r>
               <w:rPr>
@@ -2264,11 +2267,12 @@
               <w14:ligatures w14:val="standardContextual"/>
             </w:rPr>
           </w:pPr>
-          <w:hyperlink w:anchor="_Toc240906779" w:history="1">
+          <w:hyperlink w:anchor="_Toc240908207" w:history="1">
             <w:r>
               <w:rPr>
                 <w:rStyle w:val="Hipervnculo"/>
                 <w:noProof/>
+                <w:lang w:val="es-EC"/>
               </w:rPr>
               <w:t>11. Revisión por pares / autoevaluación</w:t>
             </w:r>
@@ -2291,7 +2295,7 @@
                 <w:noProof/>
                 <w:webHidden/>
               </w:rPr>
-              <w:instrText xml:space="preserve"> PAGEREF _Toc240906779 \h </w:instrText>
+              <w:instrText xml:space="preserve"> PAGEREF _Toc240908207 \h </w:instrText>
             </w:r>
             <w:r>
               <w:rPr>
@@ -2311,7 +2315,7 @@
                 <w:noProof/>
                 <w:webHidden/>
               </w:rPr>
-              <w:t>19</w:t>
+              <w:t>20</w:t>
             </w:r>
             <w:r>
               <w:rPr>
@@ -2338,7 +2342,7 @@
               <w14:ligatures w14:val="standardContextual"/>
             </w:rPr>
           </w:pPr>
-          <w:hyperlink w:anchor="_Toc240906780" w:history="1">
+          <w:hyperlink w:anchor="_Toc240908208" w:history="1">
             <w:r>
               <w:rPr>
                 <w:rStyle w:val="Hipervnculo"/>
@@ -2366,7 +2370,7 @@
                 <w:noProof/>
                 <w:webHidden/>
               </w:rPr>
-              <w:instrText xml:space="preserve"> PAGEREF _Toc240906780 \h </w:instrText>
+              <w:instrText xml:space="preserve"> PAGEREF _Toc240908208 \h </w:instrText>
             </w:r>
             <w:r>
               <w:rPr>
@@ -2386,7 +2390,7 @@
                 <w:noProof/>
                 <w:webHidden/>
               </w:rPr>
-              <w:t>20</w:t>
+              <w:t>21</w:t>
             </w:r>
             <w:r>
               <w:rPr>
@@ -2413,7 +2417,7 @@
               <w14:ligatures w14:val="standardContextual"/>
             </w:rPr>
           </w:pPr>
-          <w:hyperlink w:anchor="_Toc240906781" w:history="1">
+          <w:hyperlink w:anchor="_Toc240908209" w:history="1">
             <w:r>
               <w:rPr>
                 <w:rStyle w:val="Hipervnculo"/>
@@ -2440,7 +2444,7 @@
                 <w:noProof/>
                 <w:webHidden/>
               </w:rPr>
-              <w:instrText xml:space="preserve"> PAGEREF _Toc240906781 \h </w:instrText>
+              <w:instrText xml:space="preserve"> PAGEREF _Toc240908209 \h </w:instrText>
             </w:r>
             <w:r>
               <w:rPr>
@@ -2487,7 +2491,7 @@
               <w14:ligatures w14:val="standardContextual"/>
             </w:rPr>
           </w:pPr>
-          <w:hyperlink w:anchor="_Toc240906782" w:history="1">
+          <w:hyperlink w:anchor="_Toc240908210" w:history="1">
             <w:r>
               <w:rPr>
                 <w:rStyle w:val="Hipervnculo"/>
@@ -2516,7 +2520,7 @@
                 <w:noProof/>
                 <w:webHidden/>
               </w:rPr>
-              <w:instrText xml:space="preserve"> PAGEREF _Toc240906782 \h </w:instrText>
+              <w:instrText xml:space="preserve"> PAGEREF _Toc240908210 \h </w:instrText>
             </w:r>
             <w:r>
               <w:rPr>
@@ -2536,7 +2540,7 @@
                 <w:noProof/>
                 <w:webHidden/>
               </w:rPr>
-              <w:t>21</w:t>
+              <w:t>22</w:t>
             </w:r>
             <w:r>
               <w:rPr>
@@ -2563,7 +2567,7 @@
               <w14:ligatures w14:val="standardContextual"/>
             </w:rPr>
           </w:pPr>
-          <w:hyperlink w:anchor="_Toc240906783" w:history="1">
+          <w:hyperlink w:anchor="_Toc240908211" w:history="1">
             <w:r>
               <w:rPr>
                 <w:rStyle w:val="Hipervnculo"/>
@@ -2591,7 +2595,7 @@
                 <w:noProof/>
                 <w:webHidden/>
               </w:rPr>
-              <w:instrText xml:space="preserve"> PAGEREF _Toc240906783 \h </w:instrText>
+              <w:instrText xml:space="preserve"> PAGEREF _Toc240908211 \h </w:instrText>
             </w:r>
             <w:r>
               <w:rPr>
@@ -2611,7 +2615,7 @@
                 <w:noProof/>
                 <w:webHidden/>
               </w:rPr>
-              <w:t>21</w:t>
+              <w:t>22</w:t>
             </w:r>
             <w:r>
               <w:rPr>
@@ -2638,11 +2642,12 @@
               <w14:ligatures w14:val="standardContextual"/>
             </w:rPr>
           </w:pPr>
-          <w:hyperlink w:anchor="_Toc240906784" w:history="1">
+          <w:hyperlink w:anchor="_Toc240908212" w:history="1">
             <w:r>
               <w:rPr>
                 <w:rStyle w:val="Hipervnculo"/>
                 <w:noProof/>
+                <w:lang w:val="es-EC"/>
               </w:rPr>
               <w:t>16. Checklist final</w:t>
             </w:r>
@@ -2665,7 +2670,7 @@
                 <w:noProof/>
                 <w:webHidden/>
               </w:rPr>
-              <w:instrText xml:space="preserve"> PAGEREF _Toc240906784 \h </w:instrText>
+              <w:instrText xml:space="preserve"> PAGEREF _Toc240908212 \h </w:instrText>
             </w:r>
             <w:r>
               <w:rPr>
@@ -2712,7 +2717,7 @@
               <w14:ligatures w14:val="standardContextual"/>
             </w:rPr>
           </w:pPr>
-          <w:hyperlink w:anchor="_Toc240906785" w:history="1">
+          <w:hyperlink w:anchor="_Toc240908213" w:history="1">
             <w:r>
               <w:rPr>
                 <w:rStyle w:val="Hipervnculo"/>
@@ -2740,7 +2745,7 @@
                 <w:noProof/>
                 <w:webHidden/>
               </w:rPr>
-              <w:instrText xml:space="preserve"> PAGEREF _Toc240906785 \h </w:instrText>
+              <w:instrText xml:space="preserve"> PAGEREF _Toc240908213 \h </w:instrText>
             </w:r>
             <w:r>
               <w:rPr>
@@ -2760,7 +2765,7 @@
                 <w:noProof/>
                 <w:webHidden/>
               </w:rPr>
-              <w:t>22</w:t>
+              <w:t>23</w:t>
             </w:r>
             <w:r>
               <w:rPr>
@@ -2831,8 +2836,7 @@
           <w:lang w:val="es-EC"/>
         </w:rPr>
       </w:pPr>
-      <w:bookmarkStart w:id="0" w:name="_Toc240906782"/>
-      <w:bookmarkStart w:id="1" w:name="_Toc240906767"/>
+      <w:bookmarkStart w:id="0" w:name="_Toc240908195"/>
       <w:r>
         <w:rPr>
           <w:sz w:val="22"/>
@@ -2841,7 +2845,7 @@
         <w:lastRenderedPageBreak/>
         <w:t>1. Resumen del alcance del modelado</w:t>
       </w:r>
-      <w:bookmarkEnd w:id="1"/>
+      <w:bookmarkEnd w:id="0"/>
     </w:p>
     <w:p>
       <w:pPr>
@@ -2864,7 +2868,21 @@
         <w:rPr>
           <w:color w:val="222222"/>
         </w:rPr>
-        <w:t>Con estos requisitos se construyó un diagrama de clases con seis clases de dominio: Venta, DetalleVenta, Producto, Pedido, Cliente y Factura. Cliente y Factura entran al modelo porque sin ellas no se puede representar un sistema de facturación, aunque el caso de uso CU02 Emitir factura no se diagramó como secuencia.</w:t>
+        <w:t xml:space="preserve">Con estos requisitos se construyó un diagrama de clases con seis clases de dominio: Venta, </w:t>
+      </w:r>
+      <w:proofErr w:type="spellStart"/>
+      <w:r>
+        <w:rPr>
+          <w:color w:val="222222"/>
+        </w:rPr>
+        <w:t>DetalleVenta</w:t>
+      </w:r>
+      <w:proofErr w:type="spellEnd"/>
+      <w:r>
+        <w:rPr>
+          <w:color w:val="222222"/>
+        </w:rPr>
+        <w:t>, Producto, Pedido, Cliente y Factura. Cliente y Factura entran al modelo porque sin ellas no se puede representar un sistema de facturación, aunque el caso de uso CU02 Emitir factura no se diagramó como secuencia.</w:t>
       </w:r>
     </w:p>
     <w:p>
@@ -2888,7 +2906,21 @@
         <w:rPr>
           <w:color w:val="222222"/>
         </w:rPr>
-        <w:t>Quedan fuera del modelo la integración con la plataforma de delivery, el inventario, el cierre de caja, los reportes y la anulación de facturas. RF15 (factura a consumidor final) y CU03 Registrar cliente no se seleccionaron, pero RF15 se usa como regla de negocio en el supuesto D03.</w:t>
+        <w:t xml:space="preserve">Quedan fuera del modelo la integración con la plataforma de </w:t>
+      </w:r>
+      <w:proofErr w:type="spellStart"/>
+      <w:r>
+        <w:rPr>
+          <w:color w:val="222222"/>
+        </w:rPr>
+        <w:t>delivery</w:t>
+      </w:r>
+      <w:proofErr w:type="spellEnd"/>
+      <w:r>
+        <w:rPr>
+          <w:color w:val="222222"/>
+        </w:rPr>
+        <w:t>, el inventario, el cierre de caja, los reportes y la anulación de facturas. RF15 (factura a consumidor final) y CU03 Registrar cliente no se seleccionaron, pero RF15 se usa como regla de negocio en el supuesto D03.</w:t>
       </w:r>
     </w:p>
     <w:p>
@@ -2903,15 +2935,40 @@
           <w:sz w:val="22"/>
         </w:rPr>
       </w:pPr>
-      <w:bookmarkStart w:id="2" w:name="_Toc240906768"/>
+      <w:bookmarkStart w:id="1" w:name="_Toc240908196"/>
       <w:r>
         <w:rPr>
           <w:rFonts w:cs="Arial"/>
           <w:sz w:val="22"/>
         </w:rPr>
-        <w:t>2. Requisitos seleccionados</w:t>
+        <w:t xml:space="preserve">2. </w:t>
       </w:r>
-      <w:bookmarkEnd w:id="2"/>
+      <w:proofErr w:type="spellStart"/>
+      <w:r>
+        <w:rPr>
+          <w:rFonts w:cs="Arial"/>
+          <w:sz w:val="22"/>
+        </w:rPr>
+        <w:t>Requisitos</w:t>
+      </w:r>
+      <w:proofErr w:type="spellEnd"/>
+      <w:r>
+        <w:rPr>
+          <w:rFonts w:cs="Arial"/>
+          <w:sz w:val="22"/>
+        </w:rPr>
+        <w:t xml:space="preserve"> </w:t>
+      </w:r>
+      <w:proofErr w:type="spellStart"/>
+      <w:r>
+        <w:rPr>
+          <w:rFonts w:cs="Arial"/>
+          <w:sz w:val="22"/>
+        </w:rPr>
+        <w:t>seleccionados</w:t>
+      </w:r>
+      <w:bookmarkEnd w:id="1"/>
+      <w:proofErr w:type="spellEnd"/>
     </w:p>
     <w:p>
       <w:pPr>
@@ -3468,7 +3525,23 @@
           </w:tcPr>
           <w:p>
             <w:r>
-              <w:t>Obliga a que Pedido tenga el atributo numeroOrden y a que exista un comprobante para el cliente, distinto del ticket de cocina. En SEQ01 ese comprobante se emite con el mensaje 26 hacia ImpresoraCaja.</w:t>
+              <w:t xml:space="preserve">Obliga a que Pedido tenga el atributo </w:t>
+            </w:r>
+            <w:proofErr w:type="spellStart"/>
+            <w:r>
+              <w:t>numeroOrden</w:t>
+            </w:r>
+            <w:proofErr w:type="spellEnd"/>
+            <w:r>
+              <w:t xml:space="preserve"> y a que exista un comprobante para el cliente, distinto del ticket de cocina. En SEQ01 ese comprobante se emite con el mensaje 26 hacia </w:t>
+            </w:r>
+            <w:proofErr w:type="spellStart"/>
+            <w:r>
+              <w:t>ImpresoraCaja</w:t>
+            </w:r>
+            <w:proofErr w:type="spellEnd"/>
+            <w:r>
+              <w:t>.</w:t>
             </w:r>
           </w:p>
         </w:tc>
@@ -3798,9 +3871,11 @@
             <w:vAlign w:val="center"/>
           </w:tcPr>
           <w:p>
+            <w:proofErr w:type="spellStart"/>
             <w:r>
               <w:t>Should</w:t>
             </w:r>
+            <w:proofErr w:type="spellEnd"/>
           </w:p>
         </w:tc>
         <w:tc>
@@ -3847,7 +3922,31 @@
           </w:tcPr>
           <w:p>
             <w:r>
-              <w:t>Da origen a los atributos formaPago, efectivoRecibido y /vuelto de Venta, y al fragmento opt [pago en efectivo] de SEQ01.</w:t>
+              <w:t xml:space="preserve">Da origen a los atributos </w:t>
+            </w:r>
+            <w:proofErr w:type="spellStart"/>
+            <w:r>
+              <w:t>formaPago</w:t>
+            </w:r>
+            <w:proofErr w:type="spellEnd"/>
+            <w:r>
+              <w:t xml:space="preserve">, </w:t>
+            </w:r>
+            <w:proofErr w:type="spellStart"/>
+            <w:r>
+              <w:t>efectivoRecibido</w:t>
+            </w:r>
+            <w:proofErr w:type="spellEnd"/>
+            <w:r>
+              <w:t xml:space="preserve"> y /vuelto de Venta, y al fragmento </w:t>
+            </w:r>
+            <w:proofErr w:type="spellStart"/>
+            <w:r>
+              <w:t>opt</w:t>
+            </w:r>
+            <w:proofErr w:type="spellEnd"/>
+            <w:r>
+              <w:t xml:space="preserve"> [pago en efectivo] de SEQ01.</w:t>
             </w:r>
           </w:p>
         </w:tc>
@@ -3997,7 +4096,7 @@
           <w:lang w:val="es-EC"/>
         </w:rPr>
       </w:pPr>
-      <w:bookmarkStart w:id="3" w:name="_Toc240906769"/>
+      <w:bookmarkStart w:id="2" w:name="_Toc240908197"/>
       <w:r>
         <w:rPr>
           <w:rFonts w:cs="Arial"/>
@@ -4006,7 +4105,7 @@
         </w:rPr>
         <w:t>3. Supuestos y decisiones de modelado</w:t>
       </w:r>
-      <w:bookmarkEnd w:id="3"/>
+      <w:bookmarkEnd w:id="2"/>
     </w:p>
     <w:p>
       <w:pPr>
@@ -4515,7 +4614,15 @@
           </w:tcPr>
           <w:p>
             <w:r>
-              <w:t>La plataforma externa de delivery no se modela.</w:t>
+              <w:t xml:space="preserve">La plataforma externa de </w:t>
+            </w:r>
+            <w:proofErr w:type="spellStart"/>
+            <w:r>
+              <w:t>delivery</w:t>
+            </w:r>
+            <w:proofErr w:type="spellEnd"/>
+            <w:r>
+              <w:t xml:space="preserve"> no se modela.</w:t>
             </w:r>
           </w:p>
         </w:tc>
@@ -4539,7 +4646,15 @@
           </w:tcPr>
           <w:p>
             <w:r>
-              <w:t>En este incremento el cajero registra los pedidos manualmente y no existe conexión con la plataforma. Un pedido de delivery es una venta igual que la de mesa, diferenciada solo por el atributo canal.</w:t>
+              <w:t xml:space="preserve">En este incremento el cajero registra los pedidos manualmente y no existe conexión con la plataforma. Un pedido de </w:t>
+            </w:r>
+            <w:proofErr w:type="spellStart"/>
+            <w:r>
+              <w:t>delivery</w:t>
+            </w:r>
+            <w:proofErr w:type="spellEnd"/>
+            <w:r>
+              <w:t xml:space="preserve"> es una venta igual que la de mesa, diferenciada solo por el atributo canal.</w:t>
             </w:r>
           </w:p>
         </w:tc>
@@ -4719,7 +4834,15 @@
           </w:tcPr>
           <w:p>
             <w:r>
-              <w:t>No se modela una clase DetalleFactura.</w:t>
+              <w:t xml:space="preserve">No se modela una clase </w:t>
+            </w:r>
+            <w:proofErr w:type="spellStart"/>
+            <w:r>
+              <w:t>DetalleFactura</w:t>
+            </w:r>
+            <w:proofErr w:type="spellEnd"/>
+            <w:r>
+              <w:t>.</w:t>
             </w:r>
           </w:p>
         </w:tc>
@@ -4869,7 +4992,15 @@
           </w:tcPr>
           <w:p>
             <w:r>
-              <w:t>Clases Producto y Cliente, operación inactivar()</w:t>
+              <w:t xml:space="preserve">Clases Producto y Cliente, operación </w:t>
+            </w:r>
+            <w:proofErr w:type="gramStart"/>
+            <w:r>
+              <w:t>inactivar(</w:t>
+            </w:r>
+            <w:proofErr w:type="gramEnd"/>
+            <w:r>
+              <w:t>)</w:t>
             </w:r>
           </w:p>
         </w:tc>
@@ -4947,7 +5078,23 @@
           </w:tcPr>
           <w:p>
             <w:r>
-              <w:t>Ningún requisito del alcance la contempla, por lo que la relación Venta–Factura se mantiene en 0..1. Si se incorporara la anulación, pasaría a 0..*.</w:t>
+              <w:t xml:space="preserve">Ningún requisito del alcance la contempla, por lo que la relación Venta–Factura se mantiene en </w:t>
+            </w:r>
+            <w:proofErr w:type="gramStart"/>
+            <w:r>
+              <w:t>0..</w:t>
+            </w:r>
+            <w:proofErr w:type="gramEnd"/>
+            <w:r>
+              <w:t xml:space="preserve">1. Si se incorporara la anulación, pasaría a </w:t>
+            </w:r>
+            <w:proofErr w:type="gramStart"/>
+            <w:r>
+              <w:t>0..</w:t>
+            </w:r>
+            <w:proofErr w:type="gramEnd"/>
+            <w:r>
+              <w:t>*.</w:t>
             </w:r>
           </w:p>
         </w:tc>
@@ -5074,7 +5221,23 @@
           </w:tcPr>
           <w:p>
             <w:r>
-              <w:t>SEQ02, atributo estadoPedido, enumeración EstadoPedido, CU05, CA07</w:t>
+              <w:t xml:space="preserve">SEQ02, atributo </w:t>
+            </w:r>
+            <w:proofErr w:type="spellStart"/>
+            <w:r>
+              <w:t>estadoPedido</w:t>
+            </w:r>
+            <w:proofErr w:type="spellEnd"/>
+            <w:r>
+              <w:t xml:space="preserve">, enumeración </w:t>
+            </w:r>
+            <w:proofErr w:type="spellStart"/>
+            <w:r>
+              <w:t>EstadoPedido</w:t>
+            </w:r>
+            <w:proofErr w:type="spellEnd"/>
+            <w:r>
+              <w:t>, CU05, CA07</w:t>
             </w:r>
           </w:p>
         </w:tc>
@@ -5128,7 +5291,15 @@
           </w:tcPr>
           <w:p>
             <w:r>
-              <w:t>Venta crea sus DetalleVenta y su Pedido.</w:t>
+              <w:t xml:space="preserve">Venta crea sus </w:t>
+            </w:r>
+            <w:proofErr w:type="spellStart"/>
+            <w:r>
+              <w:t>DetalleVenta</w:t>
+            </w:r>
+            <w:proofErr w:type="spellEnd"/>
+            <w:r>
+              <w:t xml:space="preserve"> y su Pedido.</w:t>
             </w:r>
           </w:p>
         </w:tc>
@@ -5152,7 +5323,41 @@
           </w:tcPr>
           <w:p>
             <w:r>
-              <w:t>Venta es la dueña de ambas composiciones, así que es ella quien crea sus partes. ControlVenta solo coordina y le pide a Venta agregarDetalle() y generarPedido().</w:t>
+              <w:t xml:space="preserve">Venta es la dueña de ambas composiciones, así que es ella quien crea sus partes. </w:t>
+            </w:r>
+            <w:proofErr w:type="spellStart"/>
+            <w:r>
+              <w:t>ControlVenta</w:t>
+            </w:r>
+            <w:proofErr w:type="spellEnd"/>
+            <w:r>
+              <w:t xml:space="preserve"> solo coordina y le pide a Venta </w:t>
+            </w:r>
+            <w:proofErr w:type="spellStart"/>
+            <w:proofErr w:type="gramStart"/>
+            <w:r>
+              <w:t>agregarDetalle</w:t>
+            </w:r>
+            <w:proofErr w:type="spellEnd"/>
+            <w:r>
+              <w:t>(</w:t>
+            </w:r>
+            <w:proofErr w:type="gramEnd"/>
+            <w:r>
+              <w:t xml:space="preserve">) y </w:t>
+            </w:r>
+            <w:proofErr w:type="spellStart"/>
+            <w:proofErr w:type="gramStart"/>
+            <w:r>
+              <w:t>generarPedido</w:t>
+            </w:r>
+            <w:proofErr w:type="spellEnd"/>
+            <w:r>
+              <w:t>(</w:t>
+            </w:r>
+            <w:proofErr w:type="gramEnd"/>
+            <w:r>
+              <w:t>).</w:t>
             </w:r>
           </w:p>
         </w:tc>
@@ -5254,7 +5459,36 @@
           </w:tcPr>
           <w:p>
             <w:r>
-              <w:t>Venta tiene los atributos derivados /subtotalSinImpuestos, /iva y /total, que se calculan con calcularTotal(). La tabla de tarifas y las exenciones no se modelan.</w:t>
+              <w:t>Venta tiene los atributos derivados /</w:t>
+            </w:r>
+            <w:proofErr w:type="spellStart"/>
+            <w:r>
+              <w:t>subtotalSinImpuestos</w:t>
+            </w:r>
+            <w:proofErr w:type="spellEnd"/>
+            <w:r>
+              <w:t>, /</w:t>
+            </w:r>
+            <w:proofErr w:type="spellStart"/>
+            <w:r>
+              <w:t>iva</w:t>
+            </w:r>
+            <w:proofErr w:type="spellEnd"/>
+            <w:r>
+              <w:t xml:space="preserve"> y /total, que se calculan con </w:t>
+            </w:r>
+            <w:proofErr w:type="spellStart"/>
+            <w:proofErr w:type="gramStart"/>
+            <w:r>
+              <w:t>calcularTotal</w:t>
+            </w:r>
+            <w:proofErr w:type="spellEnd"/>
+            <w:r>
+              <w:t>(</w:t>
+            </w:r>
+            <w:proofErr w:type="gramEnd"/>
+            <w:r>
+              <w:t>). La tabla de tarifas y las exenciones no se modelan.</w:t>
             </w:r>
           </w:p>
         </w:tc>
@@ -5458,7 +5692,15 @@
           </w:tcPr>
           <w:p>
             <w:r>
-              <w:t>El ticket de cocina va en la bandeja con la comida, así que RF03 necesita una salida propia para el cliente. Se representa como el participante «servicio» ImpresoraCaja.</w:t>
+              <w:t xml:space="preserve">El ticket de cocina va en la bandeja con la comida, así que RF03 necesita una salida propia para el cliente. Se representa como el participante «servicio» </w:t>
+            </w:r>
+            <w:proofErr w:type="spellStart"/>
+            <w:r>
+              <w:t>ImpresoraCaja</w:t>
+            </w:r>
+            <w:proofErr w:type="spellEnd"/>
+            <w:r>
+              <w:t>.</w:t>
             </w:r>
           </w:p>
         </w:tc>
@@ -5502,7 +5744,7 @@
           <w:lang w:val="es-EC"/>
         </w:rPr>
       </w:pPr>
-      <w:bookmarkStart w:id="4" w:name="_Toc240906770"/>
+      <w:bookmarkStart w:id="3" w:name="_Toc240908198"/>
       <w:r>
         <w:rPr>
           <w:sz w:val="22"/>
@@ -5511,7 +5753,7 @@
         <w:lastRenderedPageBreak/>
         <w:t>4. Catálogo de clases</w:t>
       </w:r>
-      <w:bookmarkEnd w:id="4"/>
+      <w:bookmarkEnd w:id="3"/>
     </w:p>
     <w:p>
       <w:pPr>
@@ -5600,7 +5842,32 @@
                 <w:b/>
                 <w:color w:val="FFFFFF"/>
               </w:rPr>
-              <w:t>Origen (Req./dominio)</w:t>
+              <w:t>Origen (</w:t>
+            </w:r>
+            <w:proofErr w:type="spellStart"/>
+            <w:proofErr w:type="gramStart"/>
+            <w:r>
+              <w:rPr>
+                <w:b/>
+                <w:color w:val="FFFFFF"/>
+              </w:rPr>
+              <w:t>Req</w:t>
+            </w:r>
+            <w:proofErr w:type="spellEnd"/>
+            <w:r>
+              <w:rPr>
+                <w:b/>
+                <w:color w:val="FFFFFF"/>
+              </w:rPr>
+              <w:t>./</w:t>
+            </w:r>
+            <w:proofErr w:type="gramEnd"/>
+            <w:r>
+              <w:rPr>
+                <w:b/>
+                <w:color w:val="FFFFFF"/>
+              </w:rPr>
+              <w:t>dominio)</w:t>
             </w:r>
           </w:p>
         </w:tc>
@@ -5791,8 +6058,53 @@
             <w:vAlign w:val="center"/>
           </w:tcPr>
           <w:p>
-            <w:r>
-              <w:t>codigoVenta, fechaVenta, estado, canal, formaPago, /subtotalSinImpuestos, /iva, /total, efectivoRecibido, /vuelto</w:t>
+            <w:proofErr w:type="spellStart"/>
+            <w:r>
+              <w:t>codigoVenta</w:t>
+            </w:r>
+            <w:proofErr w:type="spellEnd"/>
+            <w:r>
+              <w:t xml:space="preserve">, </w:t>
+            </w:r>
+            <w:proofErr w:type="spellStart"/>
+            <w:r>
+              <w:t>fechaVenta</w:t>
+            </w:r>
+            <w:proofErr w:type="spellEnd"/>
+            <w:r>
+              <w:t xml:space="preserve">, estado, canal, </w:t>
+            </w:r>
+            <w:proofErr w:type="spellStart"/>
+            <w:r>
+              <w:t>formaPago</w:t>
+            </w:r>
+            <w:proofErr w:type="spellEnd"/>
+            <w:r>
+              <w:t>, /</w:t>
+            </w:r>
+            <w:proofErr w:type="spellStart"/>
+            <w:r>
+              <w:t>subtotalSinImpuestos</w:t>
+            </w:r>
+            <w:proofErr w:type="spellEnd"/>
+            <w:r>
+              <w:t>, /</w:t>
+            </w:r>
+            <w:proofErr w:type="spellStart"/>
+            <w:r>
+              <w:t>iva</w:t>
+            </w:r>
+            <w:proofErr w:type="spellEnd"/>
+            <w:r>
+              <w:t xml:space="preserve">, /total, </w:t>
+            </w:r>
+            <w:proofErr w:type="spellStart"/>
+            <w:r>
+              <w:t>efectivoRecibido</w:t>
+            </w:r>
+            <w:proofErr w:type="spellEnd"/>
+            <w:r>
+              <w:t>, /vuelto</w:t>
             </w:r>
           </w:p>
         </w:tc>
@@ -5815,9 +6127,150 @@
             <w:vAlign w:val="center"/>
           </w:tcPr>
           <w:p>
-            <w:r>
-              <w:t>registrarVenta(): void, agregarDetalle(producto: Producto, cantidad: int): void, generarPedido(): int, registrarPago(formaPago: String, monto: double): void, calcularTotal(): double, calcularVuelto(): double</w:t>
-            </w:r>
+            <w:proofErr w:type="spellStart"/>
+            <w:proofErr w:type="gramStart"/>
+            <w:r>
+              <w:t>registrarVenta</w:t>
+            </w:r>
+            <w:proofErr w:type="spellEnd"/>
+            <w:r>
+              <w:t>(</w:t>
+            </w:r>
+            <w:proofErr w:type="gramEnd"/>
+            <w:r>
+              <w:t xml:space="preserve">): </w:t>
+            </w:r>
+            <w:proofErr w:type="spellStart"/>
+            <w:r>
+              <w:t>void</w:t>
+            </w:r>
+            <w:proofErr w:type="spellEnd"/>
+            <w:r>
+              <w:t xml:space="preserve">, </w:t>
+            </w:r>
+            <w:proofErr w:type="spellStart"/>
+            <w:proofErr w:type="gramStart"/>
+            <w:r>
+              <w:t>agregarDetalle</w:t>
+            </w:r>
+            <w:proofErr w:type="spellEnd"/>
+            <w:r>
+              <w:t>(</w:t>
+            </w:r>
+            <w:proofErr w:type="gramEnd"/>
+            <w:r>
+              <w:t xml:space="preserve">producto: Producto, cantidad: </w:t>
+            </w:r>
+            <w:proofErr w:type="spellStart"/>
+            <w:r>
+              <w:t>int</w:t>
+            </w:r>
+            <w:proofErr w:type="spellEnd"/>
+            <w:r>
+              <w:t xml:space="preserve">): </w:t>
+            </w:r>
+            <w:proofErr w:type="spellStart"/>
+            <w:r>
+              <w:t>void</w:t>
+            </w:r>
+            <w:proofErr w:type="spellEnd"/>
+            <w:r>
+              <w:t xml:space="preserve">, </w:t>
+            </w:r>
+            <w:proofErr w:type="spellStart"/>
+            <w:proofErr w:type="gramStart"/>
+            <w:r>
+              <w:t>generarPedido</w:t>
+            </w:r>
+            <w:proofErr w:type="spellEnd"/>
+            <w:r>
+              <w:t>(</w:t>
+            </w:r>
+            <w:proofErr w:type="gramEnd"/>
+            <w:r>
+              <w:t xml:space="preserve">): </w:t>
+            </w:r>
+            <w:proofErr w:type="spellStart"/>
+            <w:r>
+              <w:t>int</w:t>
+            </w:r>
+            <w:proofErr w:type="spellEnd"/>
+            <w:r>
+              <w:t xml:space="preserve">, </w:t>
+            </w:r>
+            <w:proofErr w:type="spellStart"/>
+            <w:proofErr w:type="gramStart"/>
+            <w:r>
+              <w:t>registrarPago</w:t>
+            </w:r>
+            <w:proofErr w:type="spellEnd"/>
+            <w:r>
+              <w:t>(</w:t>
+            </w:r>
+            <w:proofErr w:type="spellStart"/>
+            <w:proofErr w:type="gramEnd"/>
+            <w:r>
+              <w:t>formaPago</w:t>
+            </w:r>
+            <w:proofErr w:type="spellEnd"/>
+            <w:r>
+              <w:t xml:space="preserve">: String, monto: </w:t>
+            </w:r>
+            <w:proofErr w:type="spellStart"/>
+            <w:r>
+              <w:t>double</w:t>
+            </w:r>
+            <w:proofErr w:type="spellEnd"/>
+            <w:r>
+              <w:t xml:space="preserve">): </w:t>
+            </w:r>
+            <w:proofErr w:type="spellStart"/>
+            <w:r>
+              <w:t>void</w:t>
+            </w:r>
+            <w:proofErr w:type="spellEnd"/>
+            <w:r>
+              <w:t xml:space="preserve">, </w:t>
+            </w:r>
+            <w:proofErr w:type="spellStart"/>
+            <w:proofErr w:type="gramStart"/>
+            <w:r>
+              <w:t>calcularTotal</w:t>
+            </w:r>
+            <w:proofErr w:type="spellEnd"/>
+            <w:r>
+              <w:t>(</w:t>
+            </w:r>
+            <w:proofErr w:type="gramEnd"/>
+            <w:r>
+              <w:t xml:space="preserve">): </w:t>
+            </w:r>
+            <w:proofErr w:type="spellStart"/>
+            <w:r>
+              <w:t>double</w:t>
+            </w:r>
+            <w:proofErr w:type="spellEnd"/>
+            <w:r>
+              <w:t xml:space="preserve">, </w:t>
+            </w:r>
+            <w:proofErr w:type="spellStart"/>
+            <w:proofErr w:type="gramStart"/>
+            <w:r>
+              <w:t>calcularVuelto</w:t>
+            </w:r>
+            <w:proofErr w:type="spellEnd"/>
+            <w:r>
+              <w:t>(</w:t>
+            </w:r>
+            <w:proofErr w:type="gramEnd"/>
+            <w:r>
+              <w:t xml:space="preserve">): </w:t>
+            </w:r>
+            <w:proofErr w:type="spellStart"/>
+            <w:r>
+              <w:t>double</w:t>
+            </w:r>
+            <w:proofErr w:type="spellEnd"/>
           </w:p>
         </w:tc>
       </w:tr>
@@ -5845,9 +6298,11 @@
             <w:vAlign w:val="center"/>
           </w:tcPr>
           <w:p>
+            <w:proofErr w:type="spellStart"/>
             <w:r>
               <w:t>DetalleVenta</w:t>
             </w:r>
+            <w:proofErr w:type="spellEnd"/>
           </w:p>
         </w:tc>
         <w:tc>
@@ -5918,7 +6373,15 @@
           </w:tcPr>
           <w:p>
             <w:r>
-              <w:t>cantidad, precioUnitario, observaciones, /subtotal</w:t>
+              <w:t xml:space="preserve">cantidad, </w:t>
+            </w:r>
+            <w:proofErr w:type="spellStart"/>
+            <w:r>
+              <w:t>precioUnitario</w:t>
+            </w:r>
+            <w:proofErr w:type="spellEnd"/>
+            <w:r>
+              <w:t>, observaciones, /subtotal</w:t>
             </w:r>
           </w:p>
         </w:tc>
@@ -5941,9 +6404,24 @@
             <w:vAlign w:val="center"/>
           </w:tcPr>
           <w:p>
-            <w:r>
-              <w:t>calcularSubtotal(): double</w:t>
-            </w:r>
+            <w:proofErr w:type="spellStart"/>
+            <w:proofErr w:type="gramStart"/>
+            <w:r>
+              <w:t>calcularSubtotal</w:t>
+            </w:r>
+            <w:proofErr w:type="spellEnd"/>
+            <w:r>
+              <w:t>(</w:t>
+            </w:r>
+            <w:proofErr w:type="gramEnd"/>
+            <w:r>
+              <w:t xml:space="preserve">): </w:t>
+            </w:r>
+            <w:proofErr w:type="spellStart"/>
+            <w:r>
+              <w:t>double</w:t>
+            </w:r>
+            <w:proofErr w:type="spellEnd"/>
           </w:p>
         </w:tc>
       </w:tr>
@@ -6043,8 +6521,21 @@
             <w:vAlign w:val="center"/>
           </w:tcPr>
           <w:p>
-            <w:r>
-              <w:t>codigoProducto, nombre, tipoProducto, precio, disponible, activo</w:t>
+            <w:proofErr w:type="spellStart"/>
+            <w:r>
+              <w:t>codigoProducto</w:t>
+            </w:r>
+            <w:proofErr w:type="spellEnd"/>
+            <w:r>
+              <w:t xml:space="preserve">, nombre, </w:t>
+            </w:r>
+            <w:proofErr w:type="spellStart"/>
+            <w:r>
+              <w:t>tipoProducto</w:t>
+            </w:r>
+            <w:proofErr w:type="spellEnd"/>
+            <w:r>
+              <w:t>, precio, disponible, activo</w:t>
             </w:r>
           </w:p>
         </w:tc>
@@ -6067,9 +6558,108 @@
             <w:vAlign w:val="center"/>
           </w:tcPr>
           <w:p>
-            <w:r>
-              <w:t>registrarProducto(): void, editarProducto(): void, inactivarProducto(): void, verificarDisponibilidad(): boolean, obtenerPrecio(): double</w:t>
-            </w:r>
+            <w:proofErr w:type="spellStart"/>
+            <w:proofErr w:type="gramStart"/>
+            <w:r>
+              <w:t>registrarProducto</w:t>
+            </w:r>
+            <w:proofErr w:type="spellEnd"/>
+            <w:r>
+              <w:t>(</w:t>
+            </w:r>
+            <w:proofErr w:type="gramEnd"/>
+            <w:r>
+              <w:t xml:space="preserve">): </w:t>
+            </w:r>
+            <w:proofErr w:type="spellStart"/>
+            <w:r>
+              <w:t>void</w:t>
+            </w:r>
+            <w:proofErr w:type="spellEnd"/>
+            <w:r>
+              <w:t xml:space="preserve">, </w:t>
+            </w:r>
+            <w:proofErr w:type="spellStart"/>
+            <w:proofErr w:type="gramStart"/>
+            <w:r>
+              <w:t>editarProducto</w:t>
+            </w:r>
+            <w:proofErr w:type="spellEnd"/>
+            <w:r>
+              <w:t>(</w:t>
+            </w:r>
+            <w:proofErr w:type="gramEnd"/>
+            <w:r>
+              <w:t xml:space="preserve">): </w:t>
+            </w:r>
+            <w:proofErr w:type="spellStart"/>
+            <w:r>
+              <w:t>void</w:t>
+            </w:r>
+            <w:proofErr w:type="spellEnd"/>
+            <w:r>
+              <w:t xml:space="preserve">, </w:t>
+            </w:r>
+            <w:proofErr w:type="spellStart"/>
+            <w:proofErr w:type="gramStart"/>
+            <w:r>
+              <w:t>inactivarProducto</w:t>
+            </w:r>
+            <w:proofErr w:type="spellEnd"/>
+            <w:r>
+              <w:t>(</w:t>
+            </w:r>
+            <w:proofErr w:type="gramEnd"/>
+            <w:r>
+              <w:t xml:space="preserve">): </w:t>
+            </w:r>
+            <w:proofErr w:type="spellStart"/>
+            <w:r>
+              <w:t>void</w:t>
+            </w:r>
+            <w:proofErr w:type="spellEnd"/>
+            <w:r>
+              <w:t xml:space="preserve">, </w:t>
+            </w:r>
+            <w:proofErr w:type="spellStart"/>
+            <w:proofErr w:type="gramStart"/>
+            <w:r>
+              <w:t>verificarDisponibilidad</w:t>
+            </w:r>
+            <w:proofErr w:type="spellEnd"/>
+            <w:r>
+              <w:t>(</w:t>
+            </w:r>
+            <w:proofErr w:type="gramEnd"/>
+            <w:r>
+              <w:t xml:space="preserve">): </w:t>
+            </w:r>
+            <w:proofErr w:type="spellStart"/>
+            <w:r>
+              <w:t>boolean</w:t>
+            </w:r>
+            <w:proofErr w:type="spellEnd"/>
+            <w:r>
+              <w:t xml:space="preserve">, </w:t>
+            </w:r>
+            <w:proofErr w:type="spellStart"/>
+            <w:proofErr w:type="gramStart"/>
+            <w:r>
+              <w:t>obtenerPrecio</w:t>
+            </w:r>
+            <w:proofErr w:type="spellEnd"/>
+            <w:r>
+              <w:t>(</w:t>
+            </w:r>
+            <w:proofErr w:type="gramEnd"/>
+            <w:r>
+              <w:t xml:space="preserve">): </w:t>
+            </w:r>
+            <w:proofErr w:type="spellStart"/>
+            <w:r>
+              <w:t>double</w:t>
+            </w:r>
+            <w:proofErr w:type="spellEnd"/>
           </w:p>
         </w:tc>
       </w:tr>
@@ -6169,9 +6759,35 @@
             <w:vAlign w:val="center"/>
           </w:tcPr>
           <w:p>
-            <w:r>
-              <w:t>codigoPedido, numeroOrden, estadoPedido: EstadoPedido</w:t>
-            </w:r>
+            <w:proofErr w:type="spellStart"/>
+            <w:r>
+              <w:t>codigoPedido</w:t>
+            </w:r>
+            <w:proofErr w:type="spellEnd"/>
+            <w:r>
+              <w:t xml:space="preserve">, </w:t>
+            </w:r>
+            <w:proofErr w:type="spellStart"/>
+            <w:r>
+              <w:t>numeroOrden</w:t>
+            </w:r>
+            <w:proofErr w:type="spellEnd"/>
+            <w:r>
+              <w:t xml:space="preserve">, </w:t>
+            </w:r>
+            <w:proofErr w:type="spellStart"/>
+            <w:r>
+              <w:t>estadoPedido</w:t>
+            </w:r>
+            <w:proofErr w:type="spellEnd"/>
+            <w:r>
+              <w:t xml:space="preserve">: </w:t>
+            </w:r>
+            <w:proofErr w:type="spellStart"/>
+            <w:r>
+              <w:t>EstadoPedido</w:t>
+            </w:r>
+            <w:proofErr w:type="spellEnd"/>
           </w:p>
         </w:tc>
         <w:tc>
@@ -6193,9 +6809,79 @@
             <w:vAlign w:val="center"/>
           </w:tcPr>
           <w:p>
-            <w:r>
-              <w:t>registrarPedido(): int, cambiarEstado(nuevoEstado: EstadoPedido): void, revertirEstado(): EstadoPedido</w:t>
-            </w:r>
+            <w:proofErr w:type="spellStart"/>
+            <w:proofErr w:type="gramStart"/>
+            <w:r>
+              <w:t>registrarPedido</w:t>
+            </w:r>
+            <w:proofErr w:type="spellEnd"/>
+            <w:r>
+              <w:t>(</w:t>
+            </w:r>
+            <w:proofErr w:type="gramEnd"/>
+            <w:r>
+              <w:t xml:space="preserve">): </w:t>
+            </w:r>
+            <w:proofErr w:type="spellStart"/>
+            <w:r>
+              <w:t>int</w:t>
+            </w:r>
+            <w:proofErr w:type="spellEnd"/>
+            <w:r>
+              <w:t xml:space="preserve">, </w:t>
+            </w:r>
+            <w:proofErr w:type="spellStart"/>
+            <w:proofErr w:type="gramStart"/>
+            <w:r>
+              <w:t>cambiarEstado</w:t>
+            </w:r>
+            <w:proofErr w:type="spellEnd"/>
+            <w:r>
+              <w:t>(</w:t>
+            </w:r>
+            <w:proofErr w:type="spellStart"/>
+            <w:proofErr w:type="gramEnd"/>
+            <w:r>
+              <w:t>nuevoEstado</w:t>
+            </w:r>
+            <w:proofErr w:type="spellEnd"/>
+            <w:r>
+              <w:t xml:space="preserve">: </w:t>
+            </w:r>
+            <w:proofErr w:type="spellStart"/>
+            <w:r>
+              <w:t>EstadoPedido</w:t>
+            </w:r>
+            <w:proofErr w:type="spellEnd"/>
+            <w:r>
+              <w:t xml:space="preserve">): </w:t>
+            </w:r>
+            <w:proofErr w:type="spellStart"/>
+            <w:r>
+              <w:t>void</w:t>
+            </w:r>
+            <w:proofErr w:type="spellEnd"/>
+            <w:r>
+              <w:t xml:space="preserve">, </w:t>
+            </w:r>
+            <w:proofErr w:type="spellStart"/>
+            <w:proofErr w:type="gramStart"/>
+            <w:r>
+              <w:t>revertirEstado</w:t>
+            </w:r>
+            <w:proofErr w:type="spellEnd"/>
+            <w:r>
+              <w:t>(</w:t>
+            </w:r>
+            <w:proofErr w:type="gramEnd"/>
+            <w:r>
+              <w:t xml:space="preserve">): </w:t>
+            </w:r>
+            <w:proofErr w:type="spellStart"/>
+            <w:r>
+              <w:t>EstadoPedido</w:t>
+            </w:r>
+            <w:proofErr w:type="spellEnd"/>
           </w:p>
         </w:tc>
       </w:tr>
@@ -6223,8 +6909,21 @@
             <w:vAlign w:val="center"/>
           </w:tcPr>
           <w:p>
-            <w:r>
-              <w:t>EstadoPedido «enumeration»</w:t>
+            <w:proofErr w:type="spellStart"/>
+            <w:r>
+              <w:t>EstadoPedido</w:t>
+            </w:r>
+            <w:proofErr w:type="spellEnd"/>
+            <w:r>
+              <w:t xml:space="preserve"> «</w:t>
+            </w:r>
+            <w:proofErr w:type="spellStart"/>
+            <w:r>
+              <w:t>enumeration</w:t>
+            </w:r>
+            <w:proofErr w:type="spellEnd"/>
+            <w:r>
+              <w:t>»</w:t>
             </w:r>
           </w:p>
         </w:tc>
@@ -6422,9 +7121,35 @@
             <w:vAlign w:val="center"/>
           </w:tcPr>
           <w:p>
-            <w:r>
-              <w:t>codigoCliente, nombres, identificacion, direccion, correo, telefono</w:t>
-            </w:r>
+            <w:proofErr w:type="spellStart"/>
+            <w:r>
+              <w:t>codigoCliente</w:t>
+            </w:r>
+            <w:proofErr w:type="spellEnd"/>
+            <w:r>
+              <w:t xml:space="preserve">, nombres, </w:t>
+            </w:r>
+            <w:proofErr w:type="spellStart"/>
+            <w:r>
+              <w:t>identificacion</w:t>
+            </w:r>
+            <w:proofErr w:type="spellEnd"/>
+            <w:r>
+              <w:t xml:space="preserve">, </w:t>
+            </w:r>
+            <w:proofErr w:type="spellStart"/>
+            <w:r>
+              <w:t>direccion</w:t>
+            </w:r>
+            <w:proofErr w:type="spellEnd"/>
+            <w:r>
+              <w:t xml:space="preserve">, correo, </w:t>
+            </w:r>
+            <w:proofErr w:type="spellStart"/>
+            <w:r>
+              <w:t>telefono</w:t>
+            </w:r>
+            <w:proofErr w:type="spellEnd"/>
           </w:p>
         </w:tc>
         <w:tc>
@@ -6446,9 +7171,66 @@
             <w:vAlign w:val="center"/>
           </w:tcPr>
           <w:p>
-            <w:r>
-              <w:t>registrarCliente(): void, editarCliente(): void, inactivarCliente(): void</w:t>
-            </w:r>
+            <w:proofErr w:type="spellStart"/>
+            <w:proofErr w:type="gramStart"/>
+            <w:r>
+              <w:t>registrarCliente</w:t>
+            </w:r>
+            <w:proofErr w:type="spellEnd"/>
+            <w:r>
+              <w:t>(</w:t>
+            </w:r>
+            <w:proofErr w:type="gramEnd"/>
+            <w:r>
+              <w:t xml:space="preserve">): </w:t>
+            </w:r>
+            <w:proofErr w:type="spellStart"/>
+            <w:r>
+              <w:t>void</w:t>
+            </w:r>
+            <w:proofErr w:type="spellEnd"/>
+            <w:r>
+              <w:t xml:space="preserve">, </w:t>
+            </w:r>
+            <w:proofErr w:type="spellStart"/>
+            <w:proofErr w:type="gramStart"/>
+            <w:r>
+              <w:t>editarCliente</w:t>
+            </w:r>
+            <w:proofErr w:type="spellEnd"/>
+            <w:r>
+              <w:t>(</w:t>
+            </w:r>
+            <w:proofErr w:type="gramEnd"/>
+            <w:r>
+              <w:t xml:space="preserve">): </w:t>
+            </w:r>
+            <w:proofErr w:type="spellStart"/>
+            <w:r>
+              <w:t>void</w:t>
+            </w:r>
+            <w:proofErr w:type="spellEnd"/>
+            <w:r>
+              <w:t xml:space="preserve">, </w:t>
+            </w:r>
+            <w:proofErr w:type="spellStart"/>
+            <w:proofErr w:type="gramStart"/>
+            <w:r>
+              <w:t>inactivarCliente</w:t>
+            </w:r>
+            <w:proofErr w:type="spellEnd"/>
+            <w:r>
+              <w:t>(</w:t>
+            </w:r>
+            <w:proofErr w:type="gramEnd"/>
+            <w:r>
+              <w:t xml:space="preserve">): </w:t>
+            </w:r>
+            <w:proofErr w:type="spellStart"/>
+            <w:r>
+              <w:t>void</w:t>
+            </w:r>
+            <w:proofErr w:type="spellEnd"/>
           </w:p>
         </w:tc>
       </w:tr>
@@ -6548,9 +7330,51 @@
             <w:vAlign w:val="center"/>
           </w:tcPr>
           <w:p>
-            <w:r>
-              <w:t>codigoFactura, numeroAutorizacion, fechaAutorizacion, estadoFacturacion, codigoError, observacionError</w:t>
-            </w:r>
+            <w:proofErr w:type="spellStart"/>
+            <w:r>
+              <w:t>codigoFactura</w:t>
+            </w:r>
+            <w:proofErr w:type="spellEnd"/>
+            <w:r>
+              <w:t xml:space="preserve">, </w:t>
+            </w:r>
+            <w:proofErr w:type="spellStart"/>
+            <w:r>
+              <w:t>numeroAutorizacion</w:t>
+            </w:r>
+            <w:proofErr w:type="spellEnd"/>
+            <w:r>
+              <w:t xml:space="preserve">, </w:t>
+            </w:r>
+            <w:proofErr w:type="spellStart"/>
+            <w:r>
+              <w:t>fechaAutorizacion</w:t>
+            </w:r>
+            <w:proofErr w:type="spellEnd"/>
+            <w:r>
+              <w:t xml:space="preserve">, </w:t>
+            </w:r>
+            <w:proofErr w:type="spellStart"/>
+            <w:r>
+              <w:t>estadoFacturacion</w:t>
+            </w:r>
+            <w:proofErr w:type="spellEnd"/>
+            <w:r>
+              <w:t xml:space="preserve">, </w:t>
+            </w:r>
+            <w:proofErr w:type="spellStart"/>
+            <w:r>
+              <w:t>codigoError</w:t>
+            </w:r>
+            <w:proofErr w:type="spellEnd"/>
+            <w:r>
+              <w:t xml:space="preserve">, </w:t>
+            </w:r>
+            <w:proofErr w:type="spellStart"/>
+            <w:r>
+              <w:t>observacionError</w:t>
+            </w:r>
+            <w:proofErr w:type="spellEnd"/>
           </w:p>
         </w:tc>
         <w:tc>
@@ -6572,9 +7396,137 @@
             <w:vAlign w:val="center"/>
           </w:tcPr>
           <w:p>
-            <w:r>
-              <w:t>emitirFactura(): void, enviarAlSri(): void, registrarAutorizacion(numero, fecha): void, registrarRechazo(codigo, observacion): void, reenviarAlSri(): void, reimprimir(): void</w:t>
-            </w:r>
+            <w:proofErr w:type="spellStart"/>
+            <w:proofErr w:type="gramStart"/>
+            <w:r>
+              <w:t>emitirFactura</w:t>
+            </w:r>
+            <w:proofErr w:type="spellEnd"/>
+            <w:r>
+              <w:t>(</w:t>
+            </w:r>
+            <w:proofErr w:type="gramEnd"/>
+            <w:r>
+              <w:t xml:space="preserve">): </w:t>
+            </w:r>
+            <w:proofErr w:type="spellStart"/>
+            <w:r>
+              <w:t>void</w:t>
+            </w:r>
+            <w:proofErr w:type="spellEnd"/>
+            <w:r>
+              <w:t xml:space="preserve">, </w:t>
+            </w:r>
+            <w:proofErr w:type="spellStart"/>
+            <w:proofErr w:type="gramStart"/>
+            <w:r>
+              <w:t>enviarAlSri</w:t>
+            </w:r>
+            <w:proofErr w:type="spellEnd"/>
+            <w:r>
+              <w:t>(</w:t>
+            </w:r>
+            <w:proofErr w:type="gramEnd"/>
+            <w:r>
+              <w:t xml:space="preserve">): </w:t>
+            </w:r>
+            <w:proofErr w:type="spellStart"/>
+            <w:r>
+              <w:t>void</w:t>
+            </w:r>
+            <w:proofErr w:type="spellEnd"/>
+            <w:r>
+              <w:t xml:space="preserve">, </w:t>
+            </w:r>
+            <w:proofErr w:type="spellStart"/>
+            <w:proofErr w:type="gramStart"/>
+            <w:r>
+              <w:t>registrarAutorizacion</w:t>
+            </w:r>
+            <w:proofErr w:type="spellEnd"/>
+            <w:r>
+              <w:t>(</w:t>
+            </w:r>
+            <w:proofErr w:type="gramEnd"/>
+            <w:r>
+              <w:t xml:space="preserve">numero, fecha): </w:t>
+            </w:r>
+            <w:proofErr w:type="spellStart"/>
+            <w:r>
+              <w:t>void</w:t>
+            </w:r>
+            <w:proofErr w:type="spellEnd"/>
+            <w:r>
+              <w:t xml:space="preserve">, </w:t>
+            </w:r>
+            <w:proofErr w:type="spellStart"/>
+            <w:proofErr w:type="gramStart"/>
+            <w:r>
+              <w:t>registrarRechazo</w:t>
+            </w:r>
+            <w:proofErr w:type="spellEnd"/>
+            <w:r>
+              <w:t>(</w:t>
+            </w:r>
+            <w:proofErr w:type="spellStart"/>
+            <w:proofErr w:type="gramEnd"/>
+            <w:r>
+              <w:t>codigo</w:t>
+            </w:r>
+            <w:proofErr w:type="spellEnd"/>
+            <w:r>
+              <w:t xml:space="preserve">, </w:t>
+            </w:r>
+            <w:proofErr w:type="spellStart"/>
+            <w:r>
+              <w:t>observacion</w:t>
+            </w:r>
+            <w:proofErr w:type="spellEnd"/>
+            <w:r>
+              <w:t xml:space="preserve">): </w:t>
+            </w:r>
+            <w:proofErr w:type="spellStart"/>
+            <w:r>
+              <w:t>void</w:t>
+            </w:r>
+            <w:proofErr w:type="spellEnd"/>
+            <w:r>
+              <w:t xml:space="preserve">, </w:t>
+            </w:r>
+            <w:proofErr w:type="spellStart"/>
+            <w:proofErr w:type="gramStart"/>
+            <w:r>
+              <w:t>reenviarAlSri</w:t>
+            </w:r>
+            <w:proofErr w:type="spellEnd"/>
+            <w:r>
+              <w:t>(</w:t>
+            </w:r>
+            <w:proofErr w:type="gramEnd"/>
+            <w:r>
+              <w:t xml:space="preserve">): </w:t>
+            </w:r>
+            <w:proofErr w:type="spellStart"/>
+            <w:r>
+              <w:t>void</w:t>
+            </w:r>
+            <w:proofErr w:type="spellEnd"/>
+            <w:r>
+              <w:t xml:space="preserve">, </w:t>
+            </w:r>
+            <w:proofErr w:type="gramStart"/>
+            <w:r>
+              <w:t>reimprimir(</w:t>
+            </w:r>
+            <w:proofErr w:type="gramEnd"/>
+            <w:r>
+              <w:t xml:space="preserve">): </w:t>
+            </w:r>
+            <w:proofErr w:type="spellStart"/>
+            <w:r>
+              <w:t>void</w:t>
+            </w:r>
+            <w:proofErr w:type="spellEnd"/>
           </w:p>
         </w:tc>
       </w:tr>
@@ -6597,7 +7549,7 @@
           <w:lang w:val="es-EC"/>
         </w:rPr>
       </w:pPr>
-      <w:bookmarkStart w:id="5" w:name="_Toc240906771"/>
+      <w:bookmarkStart w:id="4" w:name="_Toc240908199"/>
       <w:r>
         <w:rPr>
           <w:rFonts w:cs="Arial"/>
@@ -6614,7 +7566,7 @@
         </w:rPr>
         <w:t>. Diagrama de clases</w:t>
       </w:r>
-      <w:bookmarkEnd w:id="5"/>
+      <w:bookmarkEnd w:id="4"/>
     </w:p>
     <w:p>
       <w:pPr>
@@ -6711,7 +7663,7 @@
           <w:lang w:val="es-EC"/>
         </w:rPr>
       </w:pPr>
-      <w:bookmarkStart w:id="6" w:name="_Toc240906772"/>
+      <w:bookmarkStart w:id="5" w:name="_Toc240908200"/>
       <w:r>
         <w:rPr>
           <w:rFonts w:cs="Arial"/>
@@ -6720,7 +7672,7 @@
         </w:rPr>
         <w:t>5.1 Justificación de relaciones</w:t>
       </w:r>
-      <w:bookmarkEnd w:id="6"/>
+      <w:bookmarkEnd w:id="5"/>
     </w:p>
     <w:p>
       <w:pPr>
@@ -6728,7 +7680,23 @@
         <w:jc w:val="both"/>
       </w:pPr>
       <w:r>
-        <w:t>En UML, la composición indica que cada parte pertenece a un solo todo y que su ciclo de vida depende de él: si el todo se elimina, sus partes se eliminan con él (Object Management Group, 2017). Como por D07 las ventas facturadas se conservan, en este modelo la composición expresa que DetalleVenta y Pedido no existen sin su Venta, no una operación de borrado.</w:t>
+        <w:t>En UML, la composición indica que cada parte pertenece a un solo todo y que su ciclo de vida depende de él: si el todo se elimina, sus partes se eliminan con él (</w:t>
+      </w:r>
+      <w:proofErr w:type="spellStart"/>
+      <w:r>
+        <w:t>Object</w:t>
+      </w:r>
+      <w:proofErr w:type="spellEnd"/>
+      <w:r>
+        <w:t xml:space="preserve"> Management Group, 2017). Como por D07 las ventas facturadas se conservan, en este modelo la composición expresa que </w:t>
+      </w:r>
+      <w:proofErr w:type="spellStart"/>
+      <w:r>
+        <w:t>DetalleVenta</w:t>
+      </w:r>
+      <w:proofErr w:type="spellEnd"/>
+      <w:r>
+        <w:t xml:space="preserve"> y Pedido no existen sin su Venta, no una operación de borrado.</w:t>
       </w:r>
     </w:p>
     <w:p>
@@ -6907,8 +7875,13 @@
           </w:tcPr>
           <w:p>
             <w:r>
-              <w:t>Venta – DetalleVenta</w:t>
-            </w:r>
+              <w:t xml:space="preserve">Venta – </w:t>
+            </w:r>
+            <w:proofErr w:type="spellStart"/>
+            <w:r>
+              <w:t>DetalleVenta</w:t>
+            </w:r>
+            <w:proofErr w:type="spellEnd"/>
           </w:p>
         </w:tc>
         <w:tc>
@@ -6955,7 +7928,15 @@
           </w:tcPr>
           <w:p>
             <w:r>
-              <w:t>1 — 1..*</w:t>
+              <w:t xml:space="preserve">1 — </w:t>
+            </w:r>
+            <w:proofErr w:type="gramStart"/>
+            <w:r>
+              <w:t>1..</w:t>
+            </w:r>
+            <w:proofErr w:type="gramEnd"/>
+            <w:r>
+              <w:t>*</w:t>
             </w:r>
           </w:p>
         </w:tc>
@@ -7111,8 +8092,13 @@
             <w:vAlign w:val="center"/>
           </w:tcPr>
           <w:p>
-            <w:r>
-              <w:t>DetalleVenta – Producto</w:t>
+            <w:proofErr w:type="spellStart"/>
+            <w:r>
+              <w:t>DetalleVenta</w:t>
+            </w:r>
+            <w:proofErr w:type="spellEnd"/>
+            <w:r>
+              <w:t xml:space="preserve"> – Producto</w:t>
             </w:r>
           </w:p>
         </w:tc>
@@ -7184,7 +8170,15 @@
           </w:tcPr>
           <w:p>
             <w:r>
-              <w:t>Cada línea apunta a un solo producto, pero un producto participa en las líneas de muchas ventas y existe en el catálogo aunque no se haya vendido.</w:t>
+              <w:t xml:space="preserve">Cada línea apunta a un solo producto, pero un producto participa en las líneas de muchas ventas y existe en el </w:t>
+            </w:r>
+            <w:proofErr w:type="gramStart"/>
+            <w:r>
+              <w:t>catálogo</w:t>
+            </w:r>
+            <w:proofErr w:type="gramEnd"/>
+            <w:r>
+              <w:t xml:space="preserve"> aunque no se haya vendido.</w:t>
             </w:r>
           </w:p>
         </w:tc>
@@ -7262,7 +8256,15 @@
           </w:tcPr>
           <w:p>
             <w:r>
-              <w:t>* — 0..1</w:t>
+              <w:t xml:space="preserve">* — </w:t>
+            </w:r>
+            <w:proofErr w:type="gramStart"/>
+            <w:r>
+              <w:t>0..</w:t>
+            </w:r>
+            <w:proofErr w:type="gramEnd"/>
+            <w:r>
+              <w:t>1</w:t>
             </w:r>
           </w:p>
         </w:tc>
@@ -7364,7 +8366,15 @@
           </w:tcPr>
           <w:p>
             <w:r>
-              <w:t>1 — 0..1</w:t>
+              <w:t xml:space="preserve">1 — </w:t>
+            </w:r>
+            <w:proofErr w:type="gramStart"/>
+            <w:r>
+              <w:t>0..</w:t>
+            </w:r>
+            <w:proofErr w:type="gramEnd"/>
+            <w:r>
+              <w:t>1</w:t>
             </w:r>
           </w:p>
         </w:tc>
@@ -7407,14 +8417,14 @@
           <w:lang w:val="es-EC"/>
         </w:rPr>
       </w:pPr>
-      <w:bookmarkStart w:id="7" w:name="_Toc240906773"/>
+      <w:bookmarkStart w:id="6" w:name="_Toc240908201"/>
       <w:r>
         <w:rPr>
           <w:lang w:val="es-EC"/>
         </w:rPr>
         <w:t>5.2 Revisión del diagrama de clases</w:t>
       </w:r>
-      <w:bookmarkEnd w:id="7"/>
+      <w:bookmarkEnd w:id="6"/>
     </w:p>
     <w:p>
       <w:pPr>
@@ -7484,7 +8494,7 @@
           <w:lang w:val="es-EC"/>
         </w:rPr>
       </w:pPr>
-      <w:bookmarkStart w:id="8" w:name="_Toc240906774"/>
+      <w:bookmarkStart w:id="7" w:name="_Toc240908202"/>
       <w:r>
         <w:rPr>
           <w:sz w:val="22"/>
@@ -7493,7 +8503,7 @@
         <w:lastRenderedPageBreak/>
         <w:t>6. Diagrama de secuencia 1</w:t>
       </w:r>
-      <w:bookmarkEnd w:id="8"/>
+      <w:bookmarkEnd w:id="7"/>
     </w:p>
     <w:p>
       <w:pPr>
@@ -7879,7 +8889,23 @@
         <w:jc w:val="both"/>
       </w:pPr>
       <w:r>
-        <w:t>La Figura 2 muestra la secuencia. Un diagrama de secuencia representa las interacciones entre los actores y los objetos del sistema durante un caso de uso (Sommerville, 2016). Se usa la clasificación boundary, control y entity para separar la interfaz, la coordinación del flujo y las clases del dominio.</w:t>
+        <w:t xml:space="preserve">La Figura 2 muestra la secuencia. Un diagrama de secuencia representa las interacciones entre los actores y los objetos del sistema durante un caso de uso (Sommerville, 2016). Se usa la clasificación </w:t>
+      </w:r>
+      <w:proofErr w:type="spellStart"/>
+      <w:r>
+        <w:t>boundary</w:t>
+      </w:r>
+      <w:proofErr w:type="spellEnd"/>
+      <w:r>
+        <w:t xml:space="preserve">, control y </w:t>
+      </w:r>
+      <w:proofErr w:type="spellStart"/>
+      <w:r>
+        <w:t>entity</w:t>
+      </w:r>
+      <w:proofErr w:type="spellEnd"/>
+      <w:r>
+        <w:t xml:space="preserve"> para separar la interfaz, la coordinación del flujo y las clases del dominio.</w:t>
       </w:r>
     </w:p>
     <w:p>
@@ -8223,8 +9249,21 @@
             <w:vAlign w:val="center"/>
           </w:tcPr>
           <w:p>
-            <w:r>
-              <w:t>PantallaVenta (boundary)</w:t>
+            <w:proofErr w:type="spellStart"/>
+            <w:r>
+              <w:t>PantallaVenta</w:t>
+            </w:r>
+            <w:proofErr w:type="spellEnd"/>
+            <w:r>
+              <w:t xml:space="preserve"> (</w:t>
+            </w:r>
+            <w:proofErr w:type="spellStart"/>
+            <w:r>
+              <w:t>boundary</w:t>
+            </w:r>
+            <w:proofErr w:type="spellEnd"/>
+            <w:r>
+              <w:t>)</w:t>
             </w:r>
           </w:p>
         </w:tc>
@@ -8325,8 +9364,13 @@
             <w:vAlign w:val="center"/>
           </w:tcPr>
           <w:p>
-            <w:r>
-              <w:t>ControlVenta (control)</w:t>
+            <w:proofErr w:type="spellStart"/>
+            <w:r>
+              <w:t>ControlVenta</w:t>
+            </w:r>
+            <w:proofErr w:type="spellEnd"/>
+            <w:r>
+              <w:t xml:space="preserve"> (control)</w:t>
             </w:r>
           </w:p>
         </w:tc>
@@ -8429,7 +9473,15 @@
           <w:p>
             <w:r>
               <w:lastRenderedPageBreak/>
-              <w:t>Venta (entity)</w:t>
+              <w:t>Venta (</w:t>
+            </w:r>
+            <w:proofErr w:type="spellStart"/>
+            <w:r>
+              <w:t>entity</w:t>
+            </w:r>
+            <w:proofErr w:type="spellEnd"/>
+            <w:r>
+              <w:t>)</w:t>
             </w:r>
           </w:p>
         </w:tc>
@@ -8531,7 +9583,15 @@
           </w:tcPr>
           <w:p>
             <w:r>
-              <w:t>Producto (entity)</w:t>
+              <w:t>Producto (</w:t>
+            </w:r>
+            <w:proofErr w:type="spellStart"/>
+            <w:r>
+              <w:t>entity</w:t>
+            </w:r>
+            <w:proofErr w:type="spellEnd"/>
+            <w:r>
+              <w:t>)</w:t>
             </w:r>
           </w:p>
         </w:tc>
@@ -8632,8 +9692,21 @@
             <w:vAlign w:val="center"/>
           </w:tcPr>
           <w:p>
-            <w:r>
-              <w:t>DetalleVenta (entity)</w:t>
+            <w:proofErr w:type="spellStart"/>
+            <w:r>
+              <w:t>DetalleVenta</w:t>
+            </w:r>
+            <w:proofErr w:type="spellEnd"/>
+            <w:r>
+              <w:t xml:space="preserve"> (</w:t>
+            </w:r>
+            <w:proofErr w:type="spellStart"/>
+            <w:r>
+              <w:t>entity</w:t>
+            </w:r>
+            <w:proofErr w:type="spellEnd"/>
+            <w:r>
+              <w:t>)</w:t>
             </w:r>
           </w:p>
         </w:tc>
@@ -8705,8 +9778,13 @@
           </w:tcPr>
           <w:p>
             <w:r>
-              <w:t>Clase DetalleVenta</w:t>
-            </w:r>
+              <w:t xml:space="preserve">Clase </w:t>
+            </w:r>
+            <w:proofErr w:type="spellStart"/>
+            <w:r>
+              <w:t>DetalleVenta</w:t>
+            </w:r>
+            <w:proofErr w:type="spellEnd"/>
           </w:p>
         </w:tc>
       </w:tr>
@@ -8735,7 +9813,15 @@
           </w:tcPr>
           <w:p>
             <w:r>
-              <w:t>Pedido (entity)</w:t>
+              <w:t>Pedido (</w:t>
+            </w:r>
+            <w:proofErr w:type="spellStart"/>
+            <w:r>
+              <w:t>entity</w:t>
+            </w:r>
+            <w:proofErr w:type="spellEnd"/>
+            <w:r>
+              <w:t>)</w:t>
             </w:r>
           </w:p>
         </w:tc>
@@ -8836,8 +9922,13 @@
             <w:vAlign w:val="center"/>
           </w:tcPr>
           <w:p>
-            <w:r>
-              <w:t>ImpresoraCocina («servicio»)</w:t>
+            <w:proofErr w:type="spellStart"/>
+            <w:r>
+              <w:t>ImpresoraCocina</w:t>
+            </w:r>
+            <w:proofErr w:type="spellEnd"/>
+            <w:r>
+              <w:t xml:space="preserve"> («servicio»)</w:t>
             </w:r>
           </w:p>
         </w:tc>
@@ -8938,8 +10029,13 @@
             <w:vAlign w:val="center"/>
           </w:tcPr>
           <w:p>
-            <w:r>
-              <w:t>ImpresoraCaja («servicio»)</w:t>
+            <w:proofErr w:type="spellStart"/>
+            <w:r>
+              <w:t>ImpresoraCaja</w:t>
+            </w:r>
+            <w:proofErr w:type="spellEnd"/>
+            <w:r>
+              <w:t xml:space="preserve"> («servicio»)</w:t>
             </w:r>
           </w:p>
         </w:tc>
@@ -9030,14 +10126,42 @@
           <w:sz w:val="22"/>
         </w:rPr>
       </w:pPr>
-      <w:bookmarkStart w:id="9" w:name="_Toc240906775"/>
+      <w:bookmarkStart w:id="8" w:name="_Toc240908203"/>
       <w:r>
         <w:rPr>
           <w:sz w:val="22"/>
         </w:rPr>
-        <w:t>7. Diagrama de secuencia 2</w:t>
+        <w:t xml:space="preserve">7. </w:t>
       </w:r>
-      <w:bookmarkEnd w:id="9"/>
+      <w:proofErr w:type="spellStart"/>
+      <w:r>
+        <w:rPr>
+          <w:sz w:val="22"/>
+        </w:rPr>
+        <w:t>Diagrama</w:t>
+      </w:r>
+      <w:proofErr w:type="spellEnd"/>
+      <w:r>
+        <w:rPr>
+          <w:sz w:val="22"/>
+        </w:rPr>
+        <w:t xml:space="preserve"> de </w:t>
+      </w:r>
+      <w:proofErr w:type="spellStart"/>
+      <w:r>
+        <w:rPr>
+          <w:sz w:val="22"/>
+        </w:rPr>
+        <w:t>secuencia</w:t>
+      </w:r>
+      <w:proofErr w:type="spellEnd"/>
+      <w:r>
+        <w:rPr>
+          <w:sz w:val="22"/>
+        </w:rPr>
+        <w:t xml:space="preserve"> 2</w:t>
+      </w:r>
+      <w:bookmarkEnd w:id="8"/>
     </w:p>
     <w:p>
       <w:pPr>
@@ -9780,8 +10904,21 @@
             <w:vAlign w:val="center"/>
           </w:tcPr>
           <w:p>
-            <w:r>
-              <w:t>PantallaCocina (boundary)</w:t>
+            <w:proofErr w:type="spellStart"/>
+            <w:r>
+              <w:t>PantallaCocina</w:t>
+            </w:r>
+            <w:proofErr w:type="spellEnd"/>
+            <w:r>
+              <w:t xml:space="preserve"> (</w:t>
+            </w:r>
+            <w:proofErr w:type="spellStart"/>
+            <w:r>
+              <w:t>boundary</w:t>
+            </w:r>
+            <w:proofErr w:type="spellEnd"/>
+            <w:r>
+              <w:t>)</w:t>
             </w:r>
           </w:p>
         </w:tc>
@@ -9882,8 +11019,13 @@
             <w:vAlign w:val="center"/>
           </w:tcPr>
           <w:p>
-            <w:r>
-              <w:t>ControlPedido (control)</w:t>
+            <w:proofErr w:type="spellStart"/>
+            <w:r>
+              <w:t>ControlPedido</w:t>
+            </w:r>
+            <w:proofErr w:type="spellEnd"/>
+            <w:r>
+              <w:t xml:space="preserve"> (control)</w:t>
             </w:r>
           </w:p>
         </w:tc>
@@ -9985,7 +11127,15 @@
           </w:tcPr>
           <w:p>
             <w:r>
-              <w:t>Pedido (entity)</w:t>
+              <w:t>Pedido (</w:t>
+            </w:r>
+            <w:proofErr w:type="spellStart"/>
+            <w:r>
+              <w:t>entity</w:t>
+            </w:r>
+            <w:proofErr w:type="spellEnd"/>
+            <w:r>
+              <w:t>)</w:t>
             </w:r>
           </w:p>
         </w:tc>
@@ -10086,8 +11236,21 @@
             <w:vAlign w:val="center"/>
           </w:tcPr>
           <w:p>
-            <w:r>
-              <w:t>PantallaVenta (boundary)</w:t>
+            <w:proofErr w:type="spellStart"/>
+            <w:r>
+              <w:t>PantallaVenta</w:t>
+            </w:r>
+            <w:proofErr w:type="spellEnd"/>
+            <w:r>
+              <w:t xml:space="preserve"> (</w:t>
+            </w:r>
+            <w:proofErr w:type="spellStart"/>
+            <w:r>
+              <w:t>boundary</w:t>
+            </w:r>
+            <w:proofErr w:type="spellEnd"/>
+            <w:r>
+              <w:t>)</w:t>
             </w:r>
           </w:p>
         </w:tc>
@@ -10183,7 +11346,7 @@
           <w:lang w:val="es-EC"/>
         </w:rPr>
       </w:pPr>
-      <w:bookmarkStart w:id="10" w:name="_Toc240906776"/>
+      <w:bookmarkStart w:id="9" w:name="_Toc240908204"/>
       <w:r>
         <w:rPr>
           <w:rFonts w:cs="Arial"/>
@@ -10193,7 +11356,7 @@
         <w:lastRenderedPageBreak/>
         <w:t>8. Consistencia clases - secuencias</w:t>
       </w:r>
-      <w:bookmarkEnd w:id="10"/>
+      <w:bookmarkEnd w:id="9"/>
     </w:p>
     <w:p>
       <w:pPr>
@@ -10402,7 +11565,28 @@
           </w:tcPr>
           <w:p>
             <w:r>
-              <w:t>SEQ01 msg 6: verificarDisponibilidad()</w:t>
+              <w:t xml:space="preserve">SEQ01 </w:t>
+            </w:r>
+            <w:proofErr w:type="spellStart"/>
+            <w:r>
+              <w:t>msg</w:t>
+            </w:r>
+            <w:proofErr w:type="spellEnd"/>
+            <w:r>
+              <w:t xml:space="preserve"> 6: </w:t>
+            </w:r>
+            <w:proofErr w:type="spellStart"/>
+            <w:proofErr w:type="gramStart"/>
+            <w:r>
+              <w:t>verificarDisponibilidad</w:t>
+            </w:r>
+            <w:proofErr w:type="spellEnd"/>
+            <w:r>
+              <w:t>(</w:t>
+            </w:r>
+            <w:proofErr w:type="gramEnd"/>
+            <w:r>
+              <w:t>)</w:t>
             </w:r>
           </w:p>
         </w:tc>
@@ -10449,9 +11633,24 @@
             <w:vAlign w:val="center"/>
           </w:tcPr>
           <w:p>
-            <w:r>
-              <w:t>verificarDisponibilidad(): boolean</w:t>
-            </w:r>
+            <w:proofErr w:type="spellStart"/>
+            <w:proofErr w:type="gramStart"/>
+            <w:r>
+              <w:t>verificarDisponibilidad</w:t>
+            </w:r>
+            <w:proofErr w:type="spellEnd"/>
+            <w:r>
+              <w:t>(</w:t>
+            </w:r>
+            <w:proofErr w:type="gramEnd"/>
+            <w:r>
+              <w:t xml:space="preserve">): </w:t>
+            </w:r>
+            <w:proofErr w:type="spellStart"/>
+            <w:r>
+              <w:t>boolean</w:t>
+            </w:r>
+            <w:proofErr w:type="spellEnd"/>
           </w:p>
         </w:tc>
         <w:tc>
@@ -10528,7 +11727,28 @@
           </w:tcPr>
           <w:p>
             <w:r>
-              <w:t>SEQ01 msg 7: agregarDetalle(producto, cantidad)</w:t>
+              <w:t xml:space="preserve">SEQ01 </w:t>
+            </w:r>
+            <w:proofErr w:type="spellStart"/>
+            <w:r>
+              <w:t>msg</w:t>
+            </w:r>
+            <w:proofErr w:type="spellEnd"/>
+            <w:r>
+              <w:t xml:space="preserve"> 7: </w:t>
+            </w:r>
+            <w:proofErr w:type="spellStart"/>
+            <w:proofErr w:type="gramStart"/>
+            <w:r>
+              <w:t>agregarDetalle</w:t>
+            </w:r>
+            <w:proofErr w:type="spellEnd"/>
+            <w:r>
+              <w:t>(</w:t>
+            </w:r>
+            <w:proofErr w:type="gramEnd"/>
+            <w:r>
+              <w:t>producto, cantidad)</w:t>
             </w:r>
           </w:p>
         </w:tc>
@@ -10575,9 +11795,32 @@
             <w:vAlign w:val="center"/>
           </w:tcPr>
           <w:p>
-            <w:r>
-              <w:t>agregarDetalle(producto: Producto, cantidad: int): void</w:t>
-            </w:r>
+            <w:proofErr w:type="spellStart"/>
+            <w:proofErr w:type="gramStart"/>
+            <w:r>
+              <w:t>agregarDetalle</w:t>
+            </w:r>
+            <w:proofErr w:type="spellEnd"/>
+            <w:r>
+              <w:t>(</w:t>
+            </w:r>
+            <w:proofErr w:type="gramEnd"/>
+            <w:r>
+              <w:t xml:space="preserve">producto: Producto, cantidad: </w:t>
+            </w:r>
+            <w:proofErr w:type="spellStart"/>
+            <w:r>
+              <w:t>int</w:t>
+            </w:r>
+            <w:proofErr w:type="spellEnd"/>
+            <w:r>
+              <w:t xml:space="preserve">): </w:t>
+            </w:r>
+            <w:proofErr w:type="spellStart"/>
+            <w:r>
+              <w:t>void</w:t>
+            </w:r>
+            <w:proofErr w:type="spellEnd"/>
           </w:p>
         </w:tc>
         <w:tc>
@@ -10624,7 +11867,15 @@
           </w:tcPr>
           <w:p>
             <w:r>
-              <w:t>Revisar → corregido: antes ControlVenta creaba el detalle; se trasladó a Venta (D10).</w:t>
+              <w:t xml:space="preserve">Revisar → corregido: antes </w:t>
+            </w:r>
+            <w:proofErr w:type="spellStart"/>
+            <w:r>
+              <w:t>ControlVenta</w:t>
+            </w:r>
+            <w:proofErr w:type="spellEnd"/>
+            <w:r>
+              <w:t xml:space="preserve"> creaba el detalle; se trasladó a Venta (D10).</w:t>
             </w:r>
           </w:p>
         </w:tc>
@@ -10654,7 +11905,28 @@
           </w:tcPr>
           <w:p>
             <w:r>
-              <w:t>SEQ01 msg 8: obtenerPrecio()</w:t>
+              <w:t xml:space="preserve">SEQ01 </w:t>
+            </w:r>
+            <w:proofErr w:type="spellStart"/>
+            <w:r>
+              <w:t>msg</w:t>
+            </w:r>
+            <w:proofErr w:type="spellEnd"/>
+            <w:r>
+              <w:t xml:space="preserve"> 8: </w:t>
+            </w:r>
+            <w:proofErr w:type="spellStart"/>
+            <w:proofErr w:type="gramStart"/>
+            <w:r>
+              <w:t>obtenerPrecio</w:t>
+            </w:r>
+            <w:proofErr w:type="spellEnd"/>
+            <w:r>
+              <w:t>(</w:t>
+            </w:r>
+            <w:proofErr w:type="gramEnd"/>
+            <w:r>
+              <w:t>)</w:t>
             </w:r>
           </w:p>
         </w:tc>
@@ -10701,9 +11973,24 @@
             <w:vAlign w:val="center"/>
           </w:tcPr>
           <w:p>
-            <w:r>
-              <w:t>obtenerPrecio(): double</w:t>
-            </w:r>
+            <w:proofErr w:type="spellStart"/>
+            <w:proofErr w:type="gramStart"/>
+            <w:r>
+              <w:t>obtenerPrecio</w:t>
+            </w:r>
+            <w:proofErr w:type="spellEnd"/>
+            <w:r>
+              <w:t>(</w:t>
+            </w:r>
+            <w:proofErr w:type="gramEnd"/>
+            <w:r>
+              <w:t xml:space="preserve">): </w:t>
+            </w:r>
+            <w:proofErr w:type="spellStart"/>
+            <w:r>
+              <w:t>double</w:t>
+            </w:r>
+            <w:proofErr w:type="spellEnd"/>
           </w:p>
         </w:tc>
         <w:tc>
@@ -10780,7 +12067,36 @@
           </w:tcPr>
           <w:p>
             <w:r>
-              <w:t>SEQ01 msg 9: «create»(producto, cantidad, precioUnitario)</w:t>
+              <w:t xml:space="preserve">SEQ01 </w:t>
+            </w:r>
+            <w:proofErr w:type="spellStart"/>
+            <w:r>
+              <w:t>msg</w:t>
+            </w:r>
+            <w:proofErr w:type="spellEnd"/>
+            <w:r>
+              <w:t xml:space="preserve"> 9: «</w:t>
+            </w:r>
+            <w:proofErr w:type="spellStart"/>
+            <w:proofErr w:type="gramStart"/>
+            <w:r>
+              <w:t>create</w:t>
+            </w:r>
+            <w:proofErr w:type="spellEnd"/>
+            <w:r>
+              <w:t>»(</w:t>
+            </w:r>
+            <w:proofErr w:type="gramEnd"/>
+            <w:r>
+              <w:t xml:space="preserve">producto, cantidad, </w:t>
+            </w:r>
+            <w:proofErr w:type="spellStart"/>
+            <w:r>
+              <w:t>precioUnitario</w:t>
+            </w:r>
+            <w:proofErr w:type="spellEnd"/>
+            <w:r>
+              <w:t>)</w:t>
             </w:r>
           </w:p>
         </w:tc>
@@ -10803,9 +12119,11 @@
             <w:vAlign w:val="center"/>
           </w:tcPr>
           <w:p>
+            <w:proofErr w:type="spellStart"/>
             <w:r>
               <w:t>DetalleVenta</w:t>
             </w:r>
+            <w:proofErr w:type="spellEnd"/>
           </w:p>
         </w:tc>
         <w:tc>
@@ -10828,8 +12146,13 @@
           </w:tcPr>
           <w:p>
             <w:r>
-              <w:t>Asociación con Producto; atributos cantidad y precioUnitario</w:t>
-            </w:r>
+              <w:t xml:space="preserve">Asociación con Producto; atributos cantidad y </w:t>
+            </w:r>
+            <w:proofErr w:type="spellStart"/>
+            <w:r>
+              <w:t>precioUnitario</w:t>
+            </w:r>
+            <w:proofErr w:type="spellEnd"/>
           </w:p>
         </w:tc>
         <w:tc>
@@ -10906,7 +12229,28 @@
           </w:tcPr>
           <w:p>
             <w:r>
-              <w:t>SEQ01 msg 10: calcularSubtotal()</w:t>
+              <w:t xml:space="preserve">SEQ01 </w:t>
+            </w:r>
+            <w:proofErr w:type="spellStart"/>
+            <w:r>
+              <w:t>msg</w:t>
+            </w:r>
+            <w:proofErr w:type="spellEnd"/>
+            <w:r>
+              <w:t xml:space="preserve"> 10: </w:t>
+            </w:r>
+            <w:proofErr w:type="spellStart"/>
+            <w:proofErr w:type="gramStart"/>
+            <w:r>
+              <w:t>calcularSubtotal</w:t>
+            </w:r>
+            <w:proofErr w:type="spellEnd"/>
+            <w:r>
+              <w:t>(</w:t>
+            </w:r>
+            <w:proofErr w:type="gramEnd"/>
+            <w:r>
+              <w:t>)</w:t>
             </w:r>
           </w:p>
         </w:tc>
@@ -10929,9 +12273,11 @@
             <w:vAlign w:val="center"/>
           </w:tcPr>
           <w:p>
+            <w:proofErr w:type="spellStart"/>
             <w:r>
               <w:t>DetalleVenta</w:t>
             </w:r>
+            <w:proofErr w:type="spellEnd"/>
           </w:p>
         </w:tc>
         <w:tc>
@@ -10953,9 +12299,24 @@
             <w:vAlign w:val="center"/>
           </w:tcPr>
           <w:p>
-            <w:r>
-              <w:t>calcularSubtotal(): double</w:t>
-            </w:r>
+            <w:proofErr w:type="spellStart"/>
+            <w:proofErr w:type="gramStart"/>
+            <w:r>
+              <w:t>calcularSubtotal</w:t>
+            </w:r>
+            <w:proofErr w:type="spellEnd"/>
+            <w:r>
+              <w:t>(</w:t>
+            </w:r>
+            <w:proofErr w:type="gramEnd"/>
+            <w:r>
+              <w:t xml:space="preserve">): </w:t>
+            </w:r>
+            <w:proofErr w:type="spellStart"/>
+            <w:r>
+              <w:t>double</w:t>
+            </w:r>
+            <w:proofErr w:type="spellEnd"/>
           </w:p>
         </w:tc>
         <w:tc>
@@ -11029,7 +12390,28 @@
           <w:p>
             <w:r>
               <w:lastRenderedPageBreak/>
-              <w:t>SEQ01 msg 11: calcularTotal()</w:t>
+              <w:t xml:space="preserve">SEQ01 </w:t>
+            </w:r>
+            <w:proofErr w:type="spellStart"/>
+            <w:r>
+              <w:t>msg</w:t>
+            </w:r>
+            <w:proofErr w:type="spellEnd"/>
+            <w:r>
+              <w:t xml:space="preserve"> 11: </w:t>
+            </w:r>
+            <w:proofErr w:type="spellStart"/>
+            <w:proofErr w:type="gramStart"/>
+            <w:r>
+              <w:t>calcularTotal</w:t>
+            </w:r>
+            <w:proofErr w:type="spellEnd"/>
+            <w:r>
+              <w:t>(</w:t>
+            </w:r>
+            <w:proofErr w:type="gramEnd"/>
+            <w:r>
+              <w:t>)</w:t>
             </w:r>
           </w:p>
         </w:tc>
@@ -11076,9 +12458,24 @@
             <w:vAlign w:val="center"/>
           </w:tcPr>
           <w:p>
-            <w:r>
-              <w:t>calcularTotal(): double</w:t>
-            </w:r>
+            <w:proofErr w:type="spellStart"/>
+            <w:proofErr w:type="gramStart"/>
+            <w:r>
+              <w:t>calcularTotal</w:t>
+            </w:r>
+            <w:proofErr w:type="spellEnd"/>
+            <w:r>
+              <w:t>(</w:t>
+            </w:r>
+            <w:proofErr w:type="gramEnd"/>
+            <w:r>
+              <w:t xml:space="preserve">): </w:t>
+            </w:r>
+            <w:proofErr w:type="spellStart"/>
+            <w:r>
+              <w:t>double</w:t>
+            </w:r>
+            <w:proofErr w:type="spellEnd"/>
           </w:p>
         </w:tc>
         <w:tc>
@@ -11125,7 +12522,15 @@
           </w:tcPr>
           <w:p>
             <w:r>
-              <w:t>Revisar → corregido: en una versión anterior el mensaje apuntaba a DetalleVenta.</w:t>
+              <w:t xml:space="preserve">Revisar → corregido: en una versión anterior el mensaje apuntaba a </w:t>
+            </w:r>
+            <w:proofErr w:type="spellStart"/>
+            <w:r>
+              <w:t>DetalleVenta</w:t>
+            </w:r>
+            <w:proofErr w:type="spellEnd"/>
+            <w:r>
+              <w:t>.</w:t>
             </w:r>
           </w:p>
         </w:tc>
@@ -11155,7 +12560,33 @@
           </w:tcPr>
           <w:p>
             <w:r>
-              <w:t>SEQ01 msg 16: registrarPago(formaPago, monto)</w:t>
+              <w:t xml:space="preserve">SEQ01 </w:t>
+            </w:r>
+            <w:proofErr w:type="spellStart"/>
+            <w:r>
+              <w:t>msg</w:t>
+            </w:r>
+            <w:proofErr w:type="spellEnd"/>
+            <w:r>
+              <w:t xml:space="preserve"> 16: </w:t>
+            </w:r>
+            <w:proofErr w:type="spellStart"/>
+            <w:proofErr w:type="gramStart"/>
+            <w:r>
+              <w:t>registrarPago</w:t>
+            </w:r>
+            <w:proofErr w:type="spellEnd"/>
+            <w:r>
+              <w:t>(</w:t>
+            </w:r>
+            <w:proofErr w:type="spellStart"/>
+            <w:proofErr w:type="gramEnd"/>
+            <w:r>
+              <w:t>formaPago</w:t>
+            </w:r>
+            <w:proofErr w:type="spellEnd"/>
+            <w:r>
+              <w:t>, monto)</w:t>
             </w:r>
           </w:p>
         </w:tc>
@@ -11207,12 +12638,72 @@
                 <w:lang w:val="en-US"/>
               </w:rPr>
             </w:pPr>
+            <w:proofErr w:type="spellStart"/>
+            <w:proofErr w:type="gramStart"/>
             <w:r>
               <w:rPr>
                 <w:lang w:val="en-US"/>
               </w:rPr>
-              <w:t>registrarPago(formaPago: String, monto: double): void; atributo formaPago</w:t>
-            </w:r>
+              <w:t>registrarPago</w:t>
+            </w:r>
+            <w:proofErr w:type="spellEnd"/>
+            <w:r>
+              <w:rPr>
+                <w:lang w:val="en-US"/>
+              </w:rPr>
+              <w:t>(</w:t>
+            </w:r>
+            <w:proofErr w:type="spellStart"/>
+            <w:proofErr w:type="gramEnd"/>
+            <w:r>
+              <w:rPr>
+                <w:lang w:val="en-US"/>
+              </w:rPr>
+              <w:t>formaPago</w:t>
+            </w:r>
+            <w:proofErr w:type="spellEnd"/>
+            <w:r>
+              <w:rPr>
+                <w:lang w:val="en-US"/>
+              </w:rPr>
+              <w:t xml:space="preserve">: String, </w:t>
+            </w:r>
+            <w:proofErr w:type="spellStart"/>
+            <w:r>
+              <w:rPr>
+                <w:lang w:val="en-US"/>
+              </w:rPr>
+              <w:t>monto</w:t>
+            </w:r>
+            <w:proofErr w:type="spellEnd"/>
+            <w:r>
+              <w:rPr>
+                <w:lang w:val="en-US"/>
+              </w:rPr>
+              <w:t xml:space="preserve">: double): void; </w:t>
+            </w:r>
+            <w:proofErr w:type="spellStart"/>
+            <w:r>
+              <w:rPr>
+                <w:lang w:val="en-US"/>
+              </w:rPr>
+              <w:t>atributo</w:t>
+            </w:r>
+            <w:proofErr w:type="spellEnd"/>
+            <w:r>
+              <w:rPr>
+                <w:lang w:val="en-US"/>
+              </w:rPr>
+              <w:t xml:space="preserve"> </w:t>
+            </w:r>
+            <w:proofErr w:type="spellStart"/>
+            <w:r>
+              <w:rPr>
+                <w:lang w:val="en-US"/>
+              </w:rPr>
+              <w:t>formaPago</w:t>
+            </w:r>
+            <w:proofErr w:type="spellEnd"/>
           </w:p>
         </w:tc>
         <w:tc>
@@ -11289,7 +12780,28 @@
           </w:tcPr>
           <w:p>
             <w:r>
-              <w:t>SEQ01 msg 17: calcularVuelto()</w:t>
+              <w:t xml:space="preserve">SEQ01 </w:t>
+            </w:r>
+            <w:proofErr w:type="spellStart"/>
+            <w:r>
+              <w:t>msg</w:t>
+            </w:r>
+            <w:proofErr w:type="spellEnd"/>
+            <w:r>
+              <w:t xml:space="preserve"> 17: </w:t>
+            </w:r>
+            <w:proofErr w:type="spellStart"/>
+            <w:proofErr w:type="gramStart"/>
+            <w:r>
+              <w:t>calcularVuelto</w:t>
+            </w:r>
+            <w:proofErr w:type="spellEnd"/>
+            <w:r>
+              <w:t>(</w:t>
+            </w:r>
+            <w:proofErr w:type="gramEnd"/>
+            <w:r>
+              <w:t>)</w:t>
             </w:r>
           </w:p>
         </w:tc>
@@ -11336,9 +12848,24 @@
             <w:vAlign w:val="center"/>
           </w:tcPr>
           <w:p>
-            <w:r>
-              <w:t>calcularVuelto(): double</w:t>
-            </w:r>
+            <w:proofErr w:type="spellStart"/>
+            <w:proofErr w:type="gramStart"/>
+            <w:r>
+              <w:t>calcularVuelto</w:t>
+            </w:r>
+            <w:proofErr w:type="spellEnd"/>
+            <w:r>
+              <w:t>(</w:t>
+            </w:r>
+            <w:proofErr w:type="gramEnd"/>
+            <w:r>
+              <w:t xml:space="preserve">): </w:t>
+            </w:r>
+            <w:proofErr w:type="spellStart"/>
+            <w:r>
+              <w:t>double</w:t>
+            </w:r>
+            <w:proofErr w:type="spellEnd"/>
           </w:p>
         </w:tc>
         <w:tc>
@@ -11385,7 +12912,15 @@
           </w:tcPr>
           <w:p>
             <w:r>
-              <w:t>Solo se ejecuta en pago en efectivo (opt).</w:t>
+              <w:t>Solo se ejecuta en pago en efectivo (</w:t>
+            </w:r>
+            <w:proofErr w:type="spellStart"/>
+            <w:r>
+              <w:t>opt</w:t>
+            </w:r>
+            <w:proofErr w:type="spellEnd"/>
+            <w:r>
+              <w:t>).</w:t>
             </w:r>
           </w:p>
         </w:tc>
@@ -11415,7 +12950,28 @@
           </w:tcPr>
           <w:p>
             <w:r>
-              <w:t>SEQ01 msg 21: registrarVenta()</w:t>
+              <w:t xml:space="preserve">SEQ01 </w:t>
+            </w:r>
+            <w:proofErr w:type="spellStart"/>
+            <w:r>
+              <w:t>msg</w:t>
+            </w:r>
+            <w:proofErr w:type="spellEnd"/>
+            <w:r>
+              <w:t xml:space="preserve"> 21: </w:t>
+            </w:r>
+            <w:proofErr w:type="spellStart"/>
+            <w:proofErr w:type="gramStart"/>
+            <w:r>
+              <w:t>registrarVenta</w:t>
+            </w:r>
+            <w:proofErr w:type="spellEnd"/>
+            <w:r>
+              <w:t>(</w:t>
+            </w:r>
+            <w:proofErr w:type="gramEnd"/>
+            <w:r>
+              <w:t>)</w:t>
             </w:r>
           </w:p>
         </w:tc>
@@ -11462,9 +13018,24 @@
             <w:vAlign w:val="center"/>
           </w:tcPr>
           <w:p>
-            <w:r>
-              <w:t>registrarVenta(): void</w:t>
-            </w:r>
+            <w:proofErr w:type="spellStart"/>
+            <w:proofErr w:type="gramStart"/>
+            <w:r>
+              <w:t>registrarVenta</w:t>
+            </w:r>
+            <w:proofErr w:type="spellEnd"/>
+            <w:r>
+              <w:t>(</w:t>
+            </w:r>
+            <w:proofErr w:type="gramEnd"/>
+            <w:r>
+              <w:t xml:space="preserve">): </w:t>
+            </w:r>
+            <w:proofErr w:type="spellStart"/>
+            <w:r>
+              <w:t>void</w:t>
+            </w:r>
+            <w:proofErr w:type="spellEnd"/>
           </w:p>
         </w:tc>
         <w:tc>
@@ -11537,7 +13108,28 @@
           </w:tcPr>
           <w:p>
             <w:r>
-              <w:t>SEQ01 msg 22: generarPedido()</w:t>
+              <w:t xml:space="preserve">SEQ01 </w:t>
+            </w:r>
+            <w:proofErr w:type="spellStart"/>
+            <w:r>
+              <w:t>msg</w:t>
+            </w:r>
+            <w:proofErr w:type="spellEnd"/>
+            <w:r>
+              <w:t xml:space="preserve"> 22: </w:t>
+            </w:r>
+            <w:proofErr w:type="spellStart"/>
+            <w:proofErr w:type="gramStart"/>
+            <w:r>
+              <w:t>generarPedido</w:t>
+            </w:r>
+            <w:proofErr w:type="spellEnd"/>
+            <w:r>
+              <w:t>(</w:t>
+            </w:r>
+            <w:proofErr w:type="gramEnd"/>
+            <w:r>
+              <w:t>)</w:t>
             </w:r>
           </w:p>
         </w:tc>
@@ -11584,9 +13176,24 @@
             <w:vAlign w:val="center"/>
           </w:tcPr>
           <w:p>
-            <w:r>
-              <w:t>generarPedido(): int</w:t>
-            </w:r>
+            <w:proofErr w:type="spellStart"/>
+            <w:proofErr w:type="gramStart"/>
+            <w:r>
+              <w:t>generarPedido</w:t>
+            </w:r>
+            <w:proofErr w:type="spellEnd"/>
+            <w:r>
+              <w:t>(</w:t>
+            </w:r>
+            <w:proofErr w:type="gramEnd"/>
+            <w:r>
+              <w:t xml:space="preserve">): </w:t>
+            </w:r>
+            <w:proofErr w:type="spellStart"/>
+            <w:r>
+              <w:t>int</w:t>
+            </w:r>
+            <w:proofErr w:type="spellEnd"/>
           </w:p>
         </w:tc>
         <w:tc>
@@ -11633,7 +13240,15 @@
           </w:tcPr>
           <w:p>
             <w:r>
-              <w:t>Revisar → corregido: antes ControlVenta creaba el pedido (D10).</w:t>
+              <w:t xml:space="preserve">Revisar → corregido: antes </w:t>
+            </w:r>
+            <w:proofErr w:type="spellStart"/>
+            <w:r>
+              <w:t>ControlVenta</w:t>
+            </w:r>
+            <w:proofErr w:type="spellEnd"/>
+            <w:r>
+              <w:t xml:space="preserve"> creaba el pedido (D10).</w:t>
             </w:r>
           </w:p>
         </w:tc>
@@ -11663,7 +13278,36 @@
           </w:tcPr>
           <w:p>
             <w:r>
-              <w:t>SEQ01 msg 23–24: «create», registrarPedido()</w:t>
+              <w:t xml:space="preserve">SEQ01 </w:t>
+            </w:r>
+            <w:proofErr w:type="spellStart"/>
+            <w:r>
+              <w:t>msg</w:t>
+            </w:r>
+            <w:proofErr w:type="spellEnd"/>
+            <w:r>
+              <w:t xml:space="preserve"> 23–24: «</w:t>
+            </w:r>
+            <w:proofErr w:type="spellStart"/>
+            <w:r>
+              <w:t>create</w:t>
+            </w:r>
+            <w:proofErr w:type="spellEnd"/>
+            <w:r>
+              <w:t xml:space="preserve">», </w:t>
+            </w:r>
+            <w:proofErr w:type="spellStart"/>
+            <w:proofErr w:type="gramStart"/>
+            <w:r>
+              <w:t>registrarPedido</w:t>
+            </w:r>
+            <w:proofErr w:type="spellEnd"/>
+            <w:r>
+              <w:t>(</w:t>
+            </w:r>
+            <w:proofErr w:type="gramEnd"/>
+            <w:r>
+              <w:t>)</w:t>
             </w:r>
           </w:p>
         </w:tc>
@@ -11710,9 +13354,24 @@
             <w:vAlign w:val="center"/>
           </w:tcPr>
           <w:p>
-            <w:r>
-              <w:t>registrarPedido(): int</w:t>
-            </w:r>
+            <w:proofErr w:type="spellStart"/>
+            <w:proofErr w:type="gramStart"/>
+            <w:r>
+              <w:t>registrarPedido</w:t>
+            </w:r>
+            <w:proofErr w:type="spellEnd"/>
+            <w:r>
+              <w:t>(</w:t>
+            </w:r>
+            <w:proofErr w:type="gramEnd"/>
+            <w:r>
+              <w:t xml:space="preserve">): </w:t>
+            </w:r>
+            <w:proofErr w:type="spellStart"/>
+            <w:r>
+              <w:t>int</w:t>
+            </w:r>
+            <w:proofErr w:type="spellEnd"/>
           </w:p>
         </w:tc>
         <w:tc>
@@ -11759,7 +13418,15 @@
           </w:tcPr>
           <w:p>
             <w:r>
-              <w:t>Revisar → corregido: antes se mezclaba el estereotipo «create» con la operación.</w:t>
+              <w:t>Revisar → corregido: antes se mezclaba el estereotipo «</w:t>
+            </w:r>
+            <w:proofErr w:type="spellStart"/>
+            <w:r>
+              <w:t>create</w:t>
+            </w:r>
+            <w:proofErr w:type="spellEnd"/>
+            <w:r>
+              <w:t>» con la operación.</w:t>
             </w:r>
           </w:p>
         </w:tc>
@@ -11790,7 +13457,41 @@
           <w:p>
             <w:r>
               <w:lastRenderedPageBreak/>
-              <w:t>SEQ01 msg 25–26: imprimirTicket(), imprimirComprobante()</w:t>
+              <w:t xml:space="preserve">SEQ01 </w:t>
+            </w:r>
+            <w:proofErr w:type="spellStart"/>
+            <w:r>
+              <w:t>msg</w:t>
+            </w:r>
+            <w:proofErr w:type="spellEnd"/>
+            <w:r>
+              <w:t xml:space="preserve"> 25–26: </w:t>
+            </w:r>
+            <w:proofErr w:type="spellStart"/>
+            <w:proofErr w:type="gramStart"/>
+            <w:r>
+              <w:t>imprimirTicket</w:t>
+            </w:r>
+            <w:proofErr w:type="spellEnd"/>
+            <w:r>
+              <w:t>(</w:t>
+            </w:r>
+            <w:proofErr w:type="gramEnd"/>
+            <w:r>
+              <w:t xml:space="preserve">), </w:t>
+            </w:r>
+            <w:proofErr w:type="spellStart"/>
+            <w:proofErr w:type="gramStart"/>
+            <w:r>
+              <w:t>imprimirComprobante</w:t>
+            </w:r>
+            <w:proofErr w:type="spellEnd"/>
+            <w:r>
+              <w:t>(</w:t>
+            </w:r>
+            <w:proofErr w:type="gramEnd"/>
+            <w:r>
+              <w:t>)</w:t>
             </w:r>
           </w:p>
         </w:tc>
@@ -11813,9 +13514,19 @@
             <w:vAlign w:val="center"/>
           </w:tcPr>
           <w:p>
-            <w:r>
-              <w:t>ImpresoraCocina, ImpresoraCaja</w:t>
-            </w:r>
+            <w:proofErr w:type="spellStart"/>
+            <w:r>
+              <w:t>ImpresoraCocina</w:t>
+            </w:r>
+            <w:proofErr w:type="spellEnd"/>
+            <w:r>
+              <w:t xml:space="preserve">, </w:t>
+            </w:r>
+            <w:proofErr w:type="spellStart"/>
+            <w:r>
+              <w:t>ImpresoraCaja</w:t>
+            </w:r>
+            <w:proofErr w:type="spellEnd"/>
           </w:p>
         </w:tc>
         <w:tc>
@@ -11886,7 +13597,15 @@
           </w:tcPr>
           <w:p>
             <w:r>
-              <w:t>No son clases del dominio. ImpresoraCaja se agregó para cubrir RF03 (D13).</w:t>
+              <w:t xml:space="preserve">No son clases del dominio. </w:t>
+            </w:r>
+            <w:proofErr w:type="spellStart"/>
+            <w:r>
+              <w:t>ImpresoraCaja</w:t>
+            </w:r>
+            <w:proofErr w:type="spellEnd"/>
+            <w:r>
+              <w:t xml:space="preserve"> se agregó para cubrir RF03 (D13).</w:t>
             </w:r>
           </w:p>
         </w:tc>
@@ -11916,7 +13635,28 @@
           </w:tcPr>
           <w:p>
             <w:r>
-              <w:t>SEQ02 msg 3: cambiarEstado(LISTO)</w:t>
+              <w:t xml:space="preserve">SEQ02 </w:t>
+            </w:r>
+            <w:proofErr w:type="spellStart"/>
+            <w:r>
+              <w:t>msg</w:t>
+            </w:r>
+            <w:proofErr w:type="spellEnd"/>
+            <w:r>
+              <w:t xml:space="preserve"> 3: </w:t>
+            </w:r>
+            <w:proofErr w:type="spellStart"/>
+            <w:proofErr w:type="gramStart"/>
+            <w:r>
+              <w:t>cambiarEstado</w:t>
+            </w:r>
+            <w:proofErr w:type="spellEnd"/>
+            <w:r>
+              <w:t>(</w:t>
+            </w:r>
+            <w:proofErr w:type="gramEnd"/>
+            <w:r>
+              <w:t>LISTO)</w:t>
             </w:r>
           </w:p>
         </w:tc>
@@ -11963,9 +13703,37 @@
             <w:vAlign w:val="center"/>
           </w:tcPr>
           <w:p>
-            <w:r>
-              <w:t>cambiarEstado(nuevoEstado: EstadoPedido): void</w:t>
-            </w:r>
+            <w:proofErr w:type="spellStart"/>
+            <w:proofErr w:type="gramStart"/>
+            <w:r>
+              <w:t>cambiarEstado</w:t>
+            </w:r>
+            <w:proofErr w:type="spellEnd"/>
+            <w:r>
+              <w:t>(</w:t>
+            </w:r>
+            <w:proofErr w:type="spellStart"/>
+            <w:proofErr w:type="gramEnd"/>
+            <w:r>
+              <w:t>nuevoEstado</w:t>
+            </w:r>
+            <w:proofErr w:type="spellEnd"/>
+            <w:r>
+              <w:t xml:space="preserve">: </w:t>
+            </w:r>
+            <w:proofErr w:type="spellStart"/>
+            <w:r>
+              <w:t>EstadoPedido</w:t>
+            </w:r>
+            <w:proofErr w:type="spellEnd"/>
+            <w:r>
+              <w:t xml:space="preserve">): </w:t>
+            </w:r>
+            <w:proofErr w:type="spellStart"/>
+            <w:r>
+              <w:t>void</w:t>
+            </w:r>
+            <w:proofErr w:type="spellEnd"/>
           </w:p>
         </w:tc>
         <w:tc>
@@ -12012,7 +13780,15 @@
           </w:tcPr>
           <w:p>
             <w:r>
-              <w:t>Revisar → corregido: la secuencia enviaba "listo" y la operación no tenía parámetros; se agregó la enumeración EstadoPedido.</w:t>
+              <w:t xml:space="preserve">Revisar → corregido: la secuencia enviaba "listo" y la operación no tenía parámetros; se agregó la enumeración </w:t>
+            </w:r>
+            <w:proofErr w:type="spellStart"/>
+            <w:r>
+              <w:t>EstadoPedido</w:t>
+            </w:r>
+            <w:proofErr w:type="spellEnd"/>
+            <w:r>
+              <w:t>.</w:t>
             </w:r>
           </w:p>
         </w:tc>
@@ -12042,7 +13818,28 @@
           </w:tcPr>
           <w:p>
             <w:r>
-              <w:t>SEQ02 msg 8: revertirEstado()</w:t>
+              <w:t xml:space="preserve">SEQ02 </w:t>
+            </w:r>
+            <w:proofErr w:type="spellStart"/>
+            <w:r>
+              <w:t>msg</w:t>
+            </w:r>
+            <w:proofErr w:type="spellEnd"/>
+            <w:r>
+              <w:t xml:space="preserve"> 8: </w:t>
+            </w:r>
+            <w:proofErr w:type="spellStart"/>
+            <w:proofErr w:type="gramStart"/>
+            <w:r>
+              <w:t>revertirEstado</w:t>
+            </w:r>
+            <w:proofErr w:type="spellEnd"/>
+            <w:r>
+              <w:t>(</w:t>
+            </w:r>
+            <w:proofErr w:type="gramEnd"/>
+            <w:r>
+              <w:t>)</w:t>
             </w:r>
           </w:p>
         </w:tc>
@@ -12089,9 +13886,24 @@
             <w:vAlign w:val="center"/>
           </w:tcPr>
           <w:p>
-            <w:r>
-              <w:t>revertirEstado(): EstadoPedido</w:t>
-            </w:r>
+            <w:proofErr w:type="spellStart"/>
+            <w:proofErr w:type="gramStart"/>
+            <w:r>
+              <w:t>revertirEstado</w:t>
+            </w:r>
+            <w:proofErr w:type="spellEnd"/>
+            <w:r>
+              <w:t>(</w:t>
+            </w:r>
+            <w:proofErr w:type="gramEnd"/>
+            <w:r>
+              <w:t xml:space="preserve">): </w:t>
+            </w:r>
+            <w:proofErr w:type="spellStart"/>
+            <w:r>
+              <w:t>EstadoPedido</w:t>
+            </w:r>
+            <w:proofErr w:type="spellEnd"/>
           </w:p>
         </w:tc>
         <w:tc>
@@ -12168,7 +13980,41 @@
           </w:tcPr>
           <w:p>
             <w:r>
-              <w:t>SEQ02 msg 4 y 9: notificarPedidoListo(), anularNotificacion()</w:t>
+              <w:t xml:space="preserve">SEQ02 </w:t>
+            </w:r>
+            <w:proofErr w:type="spellStart"/>
+            <w:r>
+              <w:t>msg</w:t>
+            </w:r>
+            <w:proofErr w:type="spellEnd"/>
+            <w:r>
+              <w:t xml:space="preserve"> 4 y 9: </w:t>
+            </w:r>
+            <w:proofErr w:type="spellStart"/>
+            <w:proofErr w:type="gramStart"/>
+            <w:r>
+              <w:t>notificarPedidoListo</w:t>
+            </w:r>
+            <w:proofErr w:type="spellEnd"/>
+            <w:r>
+              <w:t>(</w:t>
+            </w:r>
+            <w:proofErr w:type="gramEnd"/>
+            <w:r>
+              <w:t xml:space="preserve">), </w:t>
+            </w:r>
+            <w:proofErr w:type="spellStart"/>
+            <w:proofErr w:type="gramStart"/>
+            <w:r>
+              <w:t>anularNotificacion</w:t>
+            </w:r>
+            <w:proofErr w:type="spellEnd"/>
+            <w:r>
+              <w:t>(</w:t>
+            </w:r>
+            <w:proofErr w:type="gramEnd"/>
+            <w:r>
+              <w:t>)</w:t>
             </w:r>
           </w:p>
         </w:tc>
@@ -12191,9 +14037,11 @@
             <w:vAlign w:val="center"/>
           </w:tcPr>
           <w:p>
+            <w:proofErr w:type="spellStart"/>
             <w:r>
               <w:t>PantallaVenta</w:t>
             </w:r>
+            <w:proofErr w:type="spellEnd"/>
           </w:p>
         </w:tc>
         <w:tc>
@@ -12263,8 +14111,13 @@
             <w:vAlign w:val="center"/>
           </w:tcPr>
           <w:p>
-            <w:r>
-              <w:t>Boundary compartido con SEQ01; no requiere clase de dominio.</w:t>
+            <w:proofErr w:type="spellStart"/>
+            <w:r>
+              <w:t>Boundary</w:t>
+            </w:r>
+            <w:proofErr w:type="spellEnd"/>
+            <w:r>
+              <w:t xml:space="preserve"> compartido con SEQ01; no requiere clase de dominio.</w:t>
             </w:r>
           </w:p>
         </w:tc>
@@ -12284,7 +14137,7 @@
           <w:lang w:val="es-EC"/>
         </w:rPr>
       </w:pPr>
-      <w:bookmarkStart w:id="11" w:name="_Toc240906777"/>
+      <w:bookmarkStart w:id="10" w:name="_Toc240908205"/>
       <w:r>
         <w:rPr>
           <w:sz w:val="22"/>
@@ -12292,7 +14145,7 @@
         </w:rPr>
         <w:t>9. Matriz de trazabilidad</w:t>
       </w:r>
-      <w:bookmarkEnd w:id="11"/>
+      <w:bookmarkEnd w:id="10"/>
     </w:p>
     <w:p>
       <w:pPr>
@@ -12387,12 +14240,21 @@
             <w:pPr>
               <w:jc w:val="center"/>
             </w:pPr>
+            <w:proofErr w:type="spellStart"/>
             <w:r>
               <w:rPr>
                 <w:b/>
                 <w:color w:val="FFFFFF"/>
               </w:rPr>
-              <w:t>Req.</w:t>
+              <w:t>Req</w:t>
+            </w:r>
+            <w:proofErr w:type="spellEnd"/>
+            <w:r>
+              <w:rPr>
+                <w:b/>
+                <w:color w:val="FFFFFF"/>
+              </w:rPr>
+              <w:t>.</w:t>
             </w:r>
           </w:p>
         </w:tc>
@@ -12614,7 +14476,15 @@
           </w:tcPr>
           <w:p>
             <w:r>
-              <w:t>Venta, DetalleVenta, Producto</w:t>
+              <w:t xml:space="preserve">Venta, </w:t>
+            </w:r>
+            <w:proofErr w:type="spellStart"/>
+            <w:r>
+              <w:t>DetalleVenta</w:t>
+            </w:r>
+            <w:proofErr w:type="spellEnd"/>
+            <w:r>
+              <w:t>, Producto</w:t>
             </w:r>
           </w:p>
         </w:tc>
@@ -12638,7 +14508,15 @@
           </w:tcPr>
           <w:p>
             <w:r>
-              <w:t>SEQ01, msg 4–13</w:t>
+              <w:t xml:space="preserve">SEQ01, </w:t>
+            </w:r>
+            <w:proofErr w:type="spellStart"/>
+            <w:r>
+              <w:t>msg</w:t>
+            </w:r>
+            <w:proofErr w:type="spellEnd"/>
+            <w:r>
+              <w:t xml:space="preserve"> 4–13</w:t>
             </w:r>
           </w:p>
         </w:tc>
@@ -12788,7 +14666,15 @@
           </w:tcPr>
           <w:p>
             <w:r>
-              <w:t>SEQ01, msg 22–25</w:t>
+              <w:t xml:space="preserve">SEQ01, </w:t>
+            </w:r>
+            <w:proofErr w:type="spellStart"/>
+            <w:r>
+              <w:t>msg</w:t>
+            </w:r>
+            <w:proofErr w:type="spellEnd"/>
+            <w:r>
+              <w:t xml:space="preserve"> 22–25</w:t>
             </w:r>
           </w:p>
         </w:tc>
@@ -12938,7 +14824,15 @@
           </w:tcPr>
           <w:p>
             <w:r>
-              <w:t>SEQ01, msg 24 y 26</w:t>
+              <w:t xml:space="preserve">SEQ01, </w:t>
+            </w:r>
+            <w:proofErr w:type="spellStart"/>
+            <w:r>
+              <w:t>msg</w:t>
+            </w:r>
+            <w:proofErr w:type="spellEnd"/>
+            <w:r>
+              <w:t xml:space="preserve"> 24 y 26</w:t>
             </w:r>
           </w:p>
         </w:tc>
@@ -13088,7 +14982,15 @@
           </w:tcPr>
           <w:p>
             <w:r>
-              <w:t>SEQ01, msg 14–18</w:t>
+              <w:t xml:space="preserve">SEQ01, </w:t>
+            </w:r>
+            <w:proofErr w:type="spellStart"/>
+            <w:r>
+              <w:t>msg</w:t>
+            </w:r>
+            <w:proofErr w:type="spellEnd"/>
+            <w:r>
+              <w:t xml:space="preserve"> 14–18</w:t>
             </w:r>
           </w:p>
         </w:tc>
@@ -13514,8 +15416,13 @@
           </w:tcPr>
           <w:p>
             <w:r>
-              <w:t>Pedido, EstadoPedido</w:t>
-            </w:r>
+              <w:t xml:space="preserve">Pedido, </w:t>
+            </w:r>
+            <w:proofErr w:type="spellStart"/>
+            <w:r>
+              <w:t>EstadoPedido</w:t>
+            </w:r>
+            <w:proofErr w:type="spellEnd"/>
           </w:p>
         </w:tc>
         <w:tc>
@@ -13538,7 +15445,15 @@
           </w:tcPr>
           <w:p>
             <w:r>
-              <w:t>SEQ02, msg 1–5 y 6–10</w:t>
+              <w:t xml:space="preserve">SEQ02, </w:t>
+            </w:r>
+            <w:proofErr w:type="spellStart"/>
+            <w:r>
+              <w:t>msg</w:t>
+            </w:r>
+            <w:proofErr w:type="spellEnd"/>
+            <w:r>
+              <w:t xml:space="preserve"> 1–5 y 6–10</w:t>
             </w:r>
           </w:p>
         </w:tc>
@@ -13585,7 +15500,7 @@
           <w:sz w:val="22"/>
         </w:rPr>
       </w:pPr>
-      <w:bookmarkStart w:id="12" w:name="_Toc240906778"/>
+      <w:bookmarkStart w:id="11" w:name="_Toc240908206"/>
       <w:r>
         <w:rPr>
           <w:rFonts w:cs="Arial"/>
@@ -13605,9 +15520,34 @@
           <w:rFonts w:cs="Arial"/>
           <w:sz w:val="22"/>
         </w:rPr>
-        <w:t>. Análisis de un cambio</w:t>
+        <w:t xml:space="preserve">. </w:t>
       </w:r>
-      <w:bookmarkEnd w:id="12"/>
+      <w:proofErr w:type="spellStart"/>
+      <w:r>
+        <w:rPr>
+          <w:rFonts w:cs="Arial"/>
+          <w:sz w:val="22"/>
+        </w:rPr>
+        <w:t>Análisis</w:t>
+      </w:r>
+      <w:proofErr w:type="spellEnd"/>
+      <w:r>
+        <w:rPr>
+          <w:rFonts w:cs="Arial"/>
+          <w:sz w:val="22"/>
+        </w:rPr>
+        <w:t xml:space="preserve"> de un </w:t>
+      </w:r>
+      <w:proofErr w:type="spellStart"/>
+      <w:r>
+        <w:rPr>
+          <w:rFonts w:cs="Arial"/>
+          <w:sz w:val="22"/>
+        </w:rPr>
+        <w:t>cambio</w:t>
+      </w:r>
+      <w:bookmarkEnd w:id="11"/>
+      <w:proofErr w:type="spellEnd"/>
     </w:p>
     <w:p>
       <w:pPr>
@@ -14125,7 +16065,23 @@
           </w:tcPr>
           <w:p>
             <w:r>
-              <w:t>Venta guarda formaPago, efectivoRecibido y /vuelto.</w:t>
+              <w:t xml:space="preserve">Venta guarda </w:t>
+            </w:r>
+            <w:proofErr w:type="spellStart"/>
+            <w:r>
+              <w:t>formaPago</w:t>
+            </w:r>
+            <w:proofErr w:type="spellEnd"/>
+            <w:r>
+              <w:t xml:space="preserve">, </w:t>
+            </w:r>
+            <w:proofErr w:type="spellStart"/>
+            <w:r>
+              <w:t>efectivoRecibido</w:t>
+            </w:r>
+            <w:proofErr w:type="spellEnd"/>
+            <w:r>
+              <w:t xml:space="preserve"> y /vuelto.</w:t>
             </w:r>
           </w:p>
         </w:tc>
@@ -14149,7 +16105,39 @@
           </w:tcPr>
           <w:p>
             <w:r>
-              <w:t>Nueva clase Pago (formaPago, monto) en composición con Venta, 1 — 1..*. formaPago y efectivoRecibido salen de Venta; /vuelto se queda.</w:t>
+              <w:t>Nueva clase Pago (</w:t>
+            </w:r>
+            <w:proofErr w:type="spellStart"/>
+            <w:r>
+              <w:t>formaPago</w:t>
+            </w:r>
+            <w:proofErr w:type="spellEnd"/>
+            <w:r>
+              <w:t xml:space="preserve">, monto) en composición con Venta, 1 — </w:t>
+            </w:r>
+            <w:proofErr w:type="gramStart"/>
+            <w:r>
+              <w:t>1..</w:t>
+            </w:r>
+            <w:proofErr w:type="gramEnd"/>
+            <w:r>
+              <w:t xml:space="preserve">*. </w:t>
+            </w:r>
+            <w:proofErr w:type="spellStart"/>
+            <w:r>
+              <w:t>formaPago</w:t>
+            </w:r>
+            <w:proofErr w:type="spellEnd"/>
+            <w:r>
+              <w:t xml:space="preserve"> y </w:t>
+            </w:r>
+            <w:proofErr w:type="spellStart"/>
+            <w:r>
+              <w:t>efectivoRecibido</w:t>
+            </w:r>
+            <w:proofErr w:type="spellEnd"/>
+            <w:r>
+              <w:t xml:space="preserve"> salen de Venta; /vuelto se queda.</w:t>
             </w:r>
           </w:p>
         </w:tc>
@@ -14227,7 +16215,36 @@
           </w:tcPr>
           <w:p>
             <w:r>
-              <w:t>SEQ01 tiene un solo registrarPago() (msg 14–16) y un opt [pago en efectivo] para el vuelto.</w:t>
+              <w:t xml:space="preserve">SEQ01 tiene un solo </w:t>
+            </w:r>
+            <w:proofErr w:type="spellStart"/>
+            <w:proofErr w:type="gramStart"/>
+            <w:r>
+              <w:t>registrarPago</w:t>
+            </w:r>
+            <w:proofErr w:type="spellEnd"/>
+            <w:r>
+              <w:t>(</w:t>
+            </w:r>
+            <w:proofErr w:type="gramEnd"/>
+            <w:r>
+              <w:t>) (</w:t>
+            </w:r>
+            <w:proofErr w:type="spellStart"/>
+            <w:r>
+              <w:t>msg</w:t>
+            </w:r>
+            <w:proofErr w:type="spellEnd"/>
+            <w:r>
+              <w:t xml:space="preserve"> 14–16) y un </w:t>
+            </w:r>
+            <w:proofErr w:type="spellStart"/>
+            <w:r>
+              <w:t>opt</w:t>
+            </w:r>
+            <w:proofErr w:type="spellEnd"/>
+            <w:r>
+              <w:t xml:space="preserve"> [pago en efectivo] para el vuelto.</w:t>
             </w:r>
           </w:p>
         </w:tc>
@@ -14251,7 +16268,31 @@
           </w:tcPr>
           <w:p>
             <w:r>
-              <w:t>Un loop [hasta cubrir el total] en el que Venta crea un Pago en cada vuelta, y el opt del vuelto después del loop.</w:t>
+              <w:t xml:space="preserve">Un </w:t>
+            </w:r>
+            <w:proofErr w:type="spellStart"/>
+            <w:r>
+              <w:t>loop</w:t>
+            </w:r>
+            <w:proofErr w:type="spellEnd"/>
+            <w:r>
+              <w:t xml:space="preserve"> [hasta cubrir el total] en el que Venta crea un Pago en cada vuelta, y el </w:t>
+            </w:r>
+            <w:proofErr w:type="spellStart"/>
+            <w:r>
+              <w:t>opt</w:t>
+            </w:r>
+            <w:proofErr w:type="spellEnd"/>
+            <w:r>
+              <w:t xml:space="preserve"> del vuelto después del </w:t>
+            </w:r>
+            <w:proofErr w:type="spellStart"/>
+            <w:r>
+              <w:t>loop</w:t>
+            </w:r>
+            <w:proofErr w:type="spellEnd"/>
+            <w:r>
+              <w:t>.</w:t>
             </w:r>
           </w:p>
         </w:tc>
@@ -14479,7 +16520,20 @@
           </w:tcPr>
           <w:p>
             <w:r>
-              <w:t>Actualizar §4, §6, §8 y §9, y las imágenes y archivos .drawio del repositorio.</w:t>
+              <w:t xml:space="preserve">Actualizar §4, §6, §8 y §9, y las imágenes y </w:t>
+            </w:r>
+            <w:proofErr w:type="gramStart"/>
+            <w:r>
+              <w:t>archivos .</w:t>
+            </w:r>
+            <w:proofErr w:type="spellStart"/>
+            <w:r>
+              <w:t>drawio</w:t>
+            </w:r>
+            <w:proofErr w:type="spellEnd"/>
+            <w:proofErr w:type="gramEnd"/>
+            <w:r>
+              <w:t xml:space="preserve"> del repositorio.</w:t>
             </w:r>
           </w:p>
         </w:tc>
@@ -14503,7 +16557,7 @@
           <w:lang w:val="es-EC"/>
         </w:rPr>
       </w:pPr>
-      <w:bookmarkStart w:id="13" w:name="_Toc240906779"/>
+      <w:bookmarkStart w:id="12" w:name="_Toc240908207"/>
       <w:r>
         <w:rPr>
           <w:rFonts w:cs="Arial"/>
@@ -14513,7 +16567,7 @@
         <w:lastRenderedPageBreak/>
         <w:t>11. Revisión por pares / autoevaluación</w:t>
       </w:r>
-      <w:bookmarkEnd w:id="13"/>
+      <w:bookmarkEnd w:id="12"/>
     </w:p>
     <w:p>
       <w:pPr>
@@ -14722,7 +16776,15 @@
           </w:tcPr>
           <w:p>
             <w:r>
-              <w:t>Atributos que guardaban el código de otra clase (Cliente en Venta, CodigoVenta en Pedido y Factura)</w:t>
+              <w:t xml:space="preserve">Atributos que guardaban el código de otra clase (Cliente en Venta, </w:t>
+            </w:r>
+            <w:proofErr w:type="spellStart"/>
+            <w:r>
+              <w:t>CodigoVenta</w:t>
+            </w:r>
+            <w:proofErr w:type="spellEnd"/>
+            <w:r>
+              <w:t xml:space="preserve"> en Pedido y Factura)</w:t>
             </w:r>
           </w:p>
         </w:tc>
@@ -14920,7 +16982,33 @@
           </w:tcPr>
           <w:p>
             <w:r>
-              <w:t>Se agregaron verificarDisponibilidad() y obtenerPrecio()</w:t>
+              <w:t xml:space="preserve">Se agregaron </w:t>
+            </w:r>
+            <w:proofErr w:type="spellStart"/>
+            <w:proofErr w:type="gramStart"/>
+            <w:r>
+              <w:t>verificarDisponibilidad</w:t>
+            </w:r>
+            <w:proofErr w:type="spellEnd"/>
+            <w:r>
+              <w:t>(</w:t>
+            </w:r>
+            <w:proofErr w:type="gramEnd"/>
+            <w:r>
+              <w:t xml:space="preserve">) y </w:t>
+            </w:r>
+            <w:proofErr w:type="spellStart"/>
+            <w:proofErr w:type="gramStart"/>
+            <w:r>
+              <w:t>obtenerPrecio</w:t>
+            </w:r>
+            <w:proofErr w:type="spellEnd"/>
+            <w:r>
+              <w:t>(</w:t>
+            </w:r>
+            <w:proofErr w:type="gramEnd"/>
+            <w:r>
+              <w:t>)</w:t>
             </w:r>
           </w:p>
         </w:tc>
@@ -15046,7 +17134,15 @@
           </w:tcPr>
           <w:p>
             <w:r>
-              <w:t>Se agregó el participante ImpresoraCaja y el mensaje 26 (D13)</w:t>
+              <w:t xml:space="preserve">Se agregó el participante </w:t>
+            </w:r>
+            <w:proofErr w:type="spellStart"/>
+            <w:r>
+              <w:t>ImpresoraCaja</w:t>
+            </w:r>
+            <w:proofErr w:type="spellEnd"/>
+            <w:r>
+              <w:t xml:space="preserve"> y el mensaje 26 (D13)</w:t>
             </w:r>
           </w:p>
         </w:tc>
@@ -15099,8 +17195,21 @@
             <w:vAlign w:val="center"/>
           </w:tcPr>
           <w:p>
-            <w:r>
-              <w:t>ControlVenta creaba DetalleVenta y Pedido, que son partes de la composición de Venta, y el detalle no recibía el producto</w:t>
+            <w:proofErr w:type="spellStart"/>
+            <w:r>
+              <w:t>ControlVenta</w:t>
+            </w:r>
+            <w:proofErr w:type="spellEnd"/>
+            <w:r>
+              <w:t xml:space="preserve"> creaba </w:t>
+            </w:r>
+            <w:proofErr w:type="spellStart"/>
+            <w:r>
+              <w:t>DetalleVenta</w:t>
+            </w:r>
+            <w:proofErr w:type="spellEnd"/>
+            <w:r>
+              <w:t xml:space="preserve"> y Pedido, que son partes de la composición de Venta, y el detalle no recibía el producto</w:t>
             </w:r>
           </w:p>
         </w:tc>
@@ -15172,7 +17281,33 @@
           </w:tcPr>
           <w:p>
             <w:r>
-              <w:t>Venta crea sus partes con agregarDetalle() y generarPedido(), y el detalle recibe el producto (D10)</w:t>
+              <w:t xml:space="preserve">Venta crea sus partes con </w:t>
+            </w:r>
+            <w:proofErr w:type="spellStart"/>
+            <w:proofErr w:type="gramStart"/>
+            <w:r>
+              <w:t>agregarDetalle</w:t>
+            </w:r>
+            <w:proofErr w:type="spellEnd"/>
+            <w:r>
+              <w:t>(</w:t>
+            </w:r>
+            <w:proofErr w:type="gramEnd"/>
+            <w:r>
+              <w:t xml:space="preserve">) y </w:t>
+            </w:r>
+            <w:proofErr w:type="spellStart"/>
+            <w:proofErr w:type="gramStart"/>
+            <w:r>
+              <w:t>generarPedido</w:t>
+            </w:r>
+            <w:proofErr w:type="spellEnd"/>
+            <w:r>
+              <w:t>(</w:t>
+            </w:r>
+            <w:proofErr w:type="gramEnd"/>
+            <w:r>
+              <w:t>), y el detalle recibe el producto (D10)</w:t>
             </w:r>
           </w:p>
         </w:tc>
@@ -15298,8 +17433,21 @@
           </w:tcPr>
           <w:p>
             <w:r>
-              <w:t>Se agregaron parámetros y retornos, la enumeración EstadoPedido y el atributo formaPago</w:t>
-            </w:r>
+              <w:t xml:space="preserve">Se agregaron parámetros y retornos, la enumeración </w:t>
+            </w:r>
+            <w:proofErr w:type="spellStart"/>
+            <w:r>
+              <w:t>EstadoPedido</w:t>
+            </w:r>
+            <w:proofErr w:type="spellEnd"/>
+            <w:r>
+              <w:t xml:space="preserve"> y el atributo </w:t>
+            </w:r>
+            <w:proofErr w:type="spellStart"/>
+            <w:r>
+              <w:t>formaPago</w:t>
+            </w:r>
+            <w:proofErr w:type="spellEnd"/>
           </w:p>
         </w:tc>
         <w:tc>
@@ -15352,8 +17500,42 @@
           </w:tcPr>
           <w:p>
             <w:r>
-              <w:t>En SEQ01, calcularTotal() apuntaba a DetalleVenta y el «create» de Venta estaba dentro del loop</w:t>
-            </w:r>
+              <w:t xml:space="preserve">En SEQ01, </w:t>
+            </w:r>
+            <w:proofErr w:type="spellStart"/>
+            <w:proofErr w:type="gramStart"/>
+            <w:r>
+              <w:t>calcularTotal</w:t>
+            </w:r>
+            <w:proofErr w:type="spellEnd"/>
+            <w:r>
+              <w:t>(</w:t>
+            </w:r>
+            <w:proofErr w:type="gramEnd"/>
+            <w:r>
+              <w:t xml:space="preserve">) apuntaba a </w:t>
+            </w:r>
+            <w:proofErr w:type="spellStart"/>
+            <w:r>
+              <w:t>DetalleVenta</w:t>
+            </w:r>
+            <w:proofErr w:type="spellEnd"/>
+            <w:r>
+              <w:t xml:space="preserve"> y el «</w:t>
+            </w:r>
+            <w:proofErr w:type="spellStart"/>
+            <w:r>
+              <w:t>create</w:t>
+            </w:r>
+            <w:proofErr w:type="spellEnd"/>
+            <w:r>
+              <w:t xml:space="preserve">» de Venta estaba dentro del </w:t>
+            </w:r>
+            <w:proofErr w:type="spellStart"/>
+            <w:r>
+              <w:t>loop</w:t>
+            </w:r>
+            <w:proofErr w:type="spellEnd"/>
           </w:p>
         </w:tc>
         <w:tc>
@@ -15424,8 +17606,13 @@
           </w:tcPr>
           <w:p>
             <w:r>
-              <w:t>El mensaje se dirigió a Venta y la creación se movió antes del loop</w:t>
-            </w:r>
+              <w:t xml:space="preserve">El mensaje se dirigió a Venta y la creación se movió antes del </w:t>
+            </w:r>
+            <w:proofErr w:type="spellStart"/>
+            <w:r>
+              <w:t>loop</w:t>
+            </w:r>
+            <w:proofErr w:type="spellEnd"/>
           </w:p>
         </w:tc>
         <w:tc>
@@ -15477,9 +17664,19 @@
             <w:vAlign w:val="center"/>
           </w:tcPr>
           <w:p>
-            <w:r>
-              <w:t>ImpresoraCocina estaba representada como entity</w:t>
-            </w:r>
+            <w:proofErr w:type="spellStart"/>
+            <w:r>
+              <w:t>ImpresoraCocina</w:t>
+            </w:r>
+            <w:proofErr w:type="spellEnd"/>
+            <w:r>
+              <w:t xml:space="preserve"> estaba representada como </w:t>
+            </w:r>
+            <w:proofErr w:type="spellStart"/>
+            <w:r>
+              <w:t>entity</w:t>
+            </w:r>
+            <w:proofErr w:type="spellEnd"/>
           </w:p>
         </w:tc>
         <w:tc>
@@ -15605,7 +17802,15 @@
           <w:p>
             <w:r>
               <w:lastRenderedPageBreak/>
-              <w:t>Se había planteado una clase DetalleFactura con los mismos datos de la venta</w:t>
+              <w:t xml:space="preserve">Se había planteado una clase </w:t>
+            </w:r>
+            <w:proofErr w:type="spellStart"/>
+            <w:r>
+              <w:t>DetalleFactura</w:t>
+            </w:r>
+            <w:proofErr w:type="spellEnd"/>
+            <w:r>
+              <w:t xml:space="preserve"> con los mismos datos de la venta</w:t>
             </w:r>
           </w:p>
         </w:tc>
@@ -15839,7 +18044,15 @@
         <w:jc w:val="both"/>
       </w:pPr>
       <w:r>
-        <w:t>Las versiones anteriores de los diagramas quedan en el historial de commits del repositorio.</w:t>
+        <w:t xml:space="preserve">Las versiones anteriores de los diagramas quedan en el historial de </w:t>
+      </w:r>
+      <w:proofErr w:type="spellStart"/>
+      <w:r>
+        <w:t>commits</w:t>
+      </w:r>
+      <w:proofErr w:type="spellEnd"/>
+      <w:r>
+        <w:t xml:space="preserve"> del repositorio.</w:t>
       </w:r>
     </w:p>
     <w:p>
@@ -15856,7 +18069,7 @@
           <w:lang w:val="es-EC"/>
         </w:rPr>
       </w:pPr>
-      <w:bookmarkStart w:id="14" w:name="_Toc240906780"/>
+      <w:bookmarkStart w:id="13" w:name="_Toc240908208"/>
       <w:r>
         <w:rPr>
           <w:sz w:val="22"/>
@@ -15864,7 +18077,7 @@
         </w:rPr>
         <w:t>12. Conclusiones</w:t>
       </w:r>
-      <w:bookmarkEnd w:id="14"/>
+      <w:bookmarkEnd w:id="13"/>
     </w:p>
     <w:p>
       <w:pPr>
@@ -15872,7 +18085,15 @@
         <w:ind w:left="432" w:hanging="317"/>
       </w:pPr>
       <w:r>
-        <w:t>1. Modelar el dominio me obligó a separar la información propia de una clase de las relaciones con otras clases. Al principio puse códigos de otras clases como atributos y casi dupliqué el detalle de la venta en una clase DetalleFactura. La regla de negocio que definí, que una venta facturada ya no se modifica, fue lo que permitió usar el detalle de la venta como única fuente para la factura.</w:t>
+        <w:t xml:space="preserve">1. Modelar el dominio me obligó a separar la información propia de una clase de las relaciones con otras clases. Al principio puse códigos de otras clases como atributos y casi dupliqué el detalle de la venta en una clase </w:t>
+      </w:r>
+      <w:proofErr w:type="spellStart"/>
+      <w:r>
+        <w:t>DetalleFactura</w:t>
+      </w:r>
+      <w:proofErr w:type="spellEnd"/>
+      <w:r>
+        <w:t>. La regla de negocio que definí, que una venta facturada ya no se modifica, fue lo que permitió usar el detalle de la venta como única fuente para la factura.</w:t>
       </w:r>
     </w:p>
     <w:p>
@@ -15899,7 +18120,23 @@
         <w:ind w:left="432" w:hanging="317"/>
       </w:pPr>
       <w:r>
-        <w:t>4. El modelo tiene límites que hay que tener presentes. CU02 Emitir factura está en el diagrama de clases pero no tiene secuencia, la integración con la plataforma de delivery y el inventario quedaron fuera, y la eliminación del estado "en preparación" (D09) todavía debe validarse con el dueño del restaurante.</w:t>
+        <w:t xml:space="preserve">4. El modelo tiene límites que hay que tener presentes. CU02 Emitir factura está en el diagrama de </w:t>
+      </w:r>
+      <w:proofErr w:type="gramStart"/>
+      <w:r>
+        <w:t>clases</w:t>
+      </w:r>
+      <w:proofErr w:type="gramEnd"/>
+      <w:r>
+        <w:t xml:space="preserve"> pero no tiene secuencia, la integración con la plataforma de </w:t>
+      </w:r>
+      <w:proofErr w:type="spellStart"/>
+      <w:r>
+        <w:t>delivery</w:t>
+      </w:r>
+      <w:proofErr w:type="spellEnd"/>
+      <w:r>
+        <w:t xml:space="preserve"> y el inventario quedaron fuera, y la eliminación del estado "en preparación" (D09) todavía debe validarse con el dueño del restaurante.</w:t>
       </w:r>
     </w:p>
     <w:p>
@@ -15933,15 +18170,24 @@
           <w:sz w:val="22"/>
         </w:rPr>
       </w:pPr>
-      <w:bookmarkStart w:id="15" w:name="_Toc240906781"/>
+      <w:bookmarkStart w:id="14" w:name="_Toc240908209"/>
       <w:r>
         <w:rPr>
           <w:rFonts w:cs="Arial"/>
           <w:sz w:val="22"/>
         </w:rPr>
-        <w:t>13. Referencias</w:t>
+        <w:t xml:space="preserve">13. </w:t>
       </w:r>
-      <w:bookmarkEnd w:id="15"/>
+      <w:proofErr w:type="spellStart"/>
+      <w:r>
+        <w:rPr>
+          <w:rFonts w:cs="Arial"/>
+          <w:sz w:val="22"/>
+        </w:rPr>
+        <w:t>Referencias</w:t>
+      </w:r>
+      <w:bookmarkEnd w:id="14"/>
+      <w:proofErr w:type="spellEnd"/>
     </w:p>
     <w:p>
       <w:pPr>
@@ -16031,6 +18277,7 @@
           <w:szCs w:val="22"/>
         </w:rPr>
       </w:pPr>
+      <w:bookmarkStart w:id="15" w:name="_Toc240908210"/>
       <w:r>
         <w:rPr>
           <w:b/>
@@ -16062,6 +18309,7 @@
         </w:rPr>
         <w:t>. Declaración de uso de inteligencia artificial</w:t>
       </w:r>
+      <w:bookmarkEnd w:id="15"/>
     </w:p>
     <w:p>
       <w:pPr>
@@ -16240,7 +18488,15 @@
               <w:spacing w:line="250" w:lineRule="auto"/>
             </w:pPr>
             <w:r>
-              <w:t>Claude (Anthropic)</w:t>
+              <w:t>Claude (</w:t>
+            </w:r>
+            <w:proofErr w:type="spellStart"/>
+            <w:r>
+              <w:t>Anthropic</w:t>
+            </w:r>
+            <w:proofErr w:type="spellEnd"/>
+            <w:r>
+              <w:t>)</w:t>
             </w:r>
           </w:p>
         </w:tc>
@@ -16301,8 +18557,13 @@
             <w:pPr>
               <w:spacing w:line="250" w:lineRule="auto"/>
             </w:pPr>
-            <w:r>
-              <w:t>Prompt o instrucción principal</w:t>
+            <w:proofErr w:type="spellStart"/>
+            <w:r>
+              <w:t>Prompt</w:t>
+            </w:r>
+            <w:proofErr w:type="spellEnd"/>
+            <w:r>
+              <w:t xml:space="preserve"> o instrucción principal</w:t>
             </w:r>
           </w:p>
         </w:tc>
@@ -16401,7 +18662,15 @@
               <w:spacing w:line="250" w:lineRule="auto"/>
             </w:pPr>
             <w:r>
-              <w:t>El análisis, las comparaciones, las decisiones de priorización y la selección de contenido aplicada al caso fueron desarrollados y revisados por mi.</w:t>
+              <w:t xml:space="preserve">El análisis, las comparaciones, las decisiones de priorización y la selección de contenido aplicada al caso fueron desarrollados y revisados por </w:t>
+            </w:r>
+            <w:proofErr w:type="spellStart"/>
+            <w:r>
+              <w:t>mi</w:t>
+            </w:r>
+            <w:proofErr w:type="spellEnd"/>
+            <w:r>
+              <w:t>.</w:t>
             </w:r>
           </w:p>
         </w:tc>
@@ -16461,12 +18730,14 @@
           <w:lang w:val="es-EC"/>
         </w:rPr>
       </w:pPr>
+      <w:bookmarkStart w:id="16" w:name="_Toc240908211"/>
       <w:r>
         <w:rPr>
           <w:lang w:val="es-EC"/>
         </w:rPr>
         <w:t>15. Artefactos en el repositorio</w:t>
       </w:r>
+      <w:bookmarkEnd w:id="16"/>
     </w:p>
     <w:p>
       <w:pPr>
@@ -16673,8 +18944,13 @@
           </w:tcPr>
           <w:p>
             <w:r>
-              <w:t>Ae5-Modelos-UML/fuentes/diagrama-clases.drawio</w:t>
-            </w:r>
+              <w:t>Ae5-Modelos-UML/fuentes/diagrama-</w:t>
+            </w:r>
+            <w:proofErr w:type="spellStart"/>
+            <w:r>
+              <w:t>clases.drawio</w:t>
+            </w:r>
+            <w:proofErr w:type="spellEnd"/>
           </w:p>
         </w:tc>
         <w:tc>
@@ -16696,9 +18972,16 @@
             <w:vAlign w:val="center"/>
           </w:tcPr>
           <w:p>
-            <w:r>
-              <w:t>.drawio</w:t>
-            </w:r>
+            <w:proofErr w:type="gramStart"/>
+            <w:r>
+              <w:t>.</w:t>
+            </w:r>
+            <w:proofErr w:type="spellStart"/>
+            <w:r>
+              <w:t>drawio</w:t>
+            </w:r>
+            <w:proofErr w:type="spellEnd"/>
+            <w:proofErr w:type="gramEnd"/>
           </w:p>
         </w:tc>
         <w:tc>
@@ -16798,9 +19081,16 @@
             <w:vAlign w:val="center"/>
           </w:tcPr>
           <w:p>
-            <w:r>
-              <w:t>.drawio</w:t>
-            </w:r>
+            <w:proofErr w:type="gramStart"/>
+            <w:r>
+              <w:t>.</w:t>
+            </w:r>
+            <w:proofErr w:type="spellStart"/>
+            <w:r>
+              <w:t>drawio</w:t>
+            </w:r>
+            <w:proofErr w:type="spellEnd"/>
+            <w:proofErr w:type="gramEnd"/>
           </w:p>
         </w:tc>
         <w:tc>
@@ -16900,9 +19190,16 @@
             <w:vAlign w:val="center"/>
           </w:tcPr>
           <w:p>
-            <w:r>
-              <w:t>.drawio</w:t>
-            </w:r>
+            <w:proofErr w:type="gramStart"/>
+            <w:r>
+              <w:t>.</w:t>
+            </w:r>
+            <w:proofErr w:type="spellStart"/>
+            <w:r>
+              <w:t>drawio</w:t>
+            </w:r>
+            <w:proofErr w:type="spellEnd"/>
+            <w:proofErr w:type="gramEnd"/>
           </w:p>
         </w:tc>
         <w:tc>
@@ -16979,7 +19276,15 @@
           </w:tcPr>
           <w:p>
             <w:r>
-              <w:t>Ae5-Modelos-UML/imagenes/</w:t>
+              <w:t>Ae5-Modelos-UML/</w:t>
+            </w:r>
+            <w:proofErr w:type="spellStart"/>
+            <w:r>
+              <w:t>imagenes</w:t>
+            </w:r>
+            <w:proofErr w:type="spellEnd"/>
+            <w:r>
+              <w:t>/</w:t>
             </w:r>
           </w:p>
         </w:tc>
@@ -17046,12 +19351,28 @@
           <w:lang w:val="es-EC"/>
         </w:rPr>
       </w:pPr>
+      <w:bookmarkStart w:id="17" w:name="_Toc240908212"/>
       <w:r>
         <w:rPr>
           <w:lang w:val="es-EC"/>
         </w:rPr>
-        <w:t>16. Checklist final</w:t>
+        <w:t xml:space="preserve">16. </w:t>
       </w:r>
+      <w:proofErr w:type="spellStart"/>
+      <w:r>
+        <w:rPr>
+          <w:lang w:val="es-EC"/>
+        </w:rPr>
+        <w:t>Checklist</w:t>
+      </w:r>
+      <w:proofErr w:type="spellEnd"/>
+      <w:r>
+        <w:rPr>
+          <w:lang w:val="es-EC"/>
+        </w:rPr>
+        <w:t xml:space="preserve"> final</w:t>
+      </w:r>
+      <w:bookmarkEnd w:id="17"/>
     </w:p>
     <w:p>
       <w:pPr>
@@ -17157,12 +19478,14 @@
           <w:lang w:val="es-EC"/>
         </w:rPr>
       </w:pPr>
+      <w:bookmarkStart w:id="18" w:name="_Toc240908213"/>
       <w:r>
         <w:rPr>
           <w:lang w:val="es-EC"/>
         </w:rPr>
         <w:t>Anexo A. Criterios de aceptación citados</w:t>
       </w:r>
+      <w:bookmarkEnd w:id="18"/>
     </w:p>
     <w:p>
       <w:pPr>
@@ -18749,7 +21072,6 @@
           </w:p>
         </w:tc>
       </w:tr>
-      <w:bookmarkEnd w:id="0"/>
     </w:tbl>
     <w:p>
       <w:pPr>

</xml_diff>